<commit_message>
:sparkles: Completed Data selection and imputation
Completed data selection and imputation of missing data sections
on document
</commit_message>
<xml_diff>
--- a/Jamie_Lawlor_Road_to_world_record.docx
+++ b/Jamie_Lawlor_Road_to_world_record.docx
@@ -373,7 +373,34 @@
             <w:bCs/>
             <w:lang w:val="en-GB"/>
           </w:rPr>
-          <w:t>......................</w:t>
+          <w:t>..</w:t>
+        </w:r>
+        <w:r>
+          <w:rPr>
+            <w:rFonts w:ascii="Segoe UI" w:hAnsi="Segoe UI" w:cs="Segoe UI"/>
+            <w:b/>
+            <w:bCs/>
+            <w:lang w:val="en-GB"/>
+          </w:rPr>
+          <w:t>..................................</w:t>
+        </w:r>
+        <w:r>
+          <w:rPr>
+            <w:rFonts w:ascii="Segoe UI" w:hAnsi="Segoe UI" w:cs="Segoe UI"/>
+            <w:b/>
+            <w:bCs/>
+            <w:lang w:val="en-GB"/>
+          </w:rPr>
+          <w:t>........</w:t>
+        </w:r>
+        <w:r>
+          <w:rPr>
+            <w:rFonts w:ascii="Segoe UI" w:hAnsi="Segoe UI" w:cs="Segoe UI"/>
+            <w:b/>
+            <w:bCs/>
+            <w:lang w:val="en-GB"/>
+          </w:rPr>
+          <w:t>4</w:t>
         </w:r>
       </w:hyperlink>
     </w:p>
@@ -407,7 +434,31 @@
             <w:b/>
             <w:bCs/>
           </w:rPr>
-          <w:t>……………………...…………………………………….…….</w:t>
+          <w:t>……………………...………………</w:t>
+        </w:r>
+        <w:r>
+          <w:rPr>
+            <w:rFonts w:ascii="Segoe UI" w:hAnsi="Segoe UI" w:cs="Segoe UI"/>
+            <w:b/>
+            <w:bCs/>
+          </w:rPr>
+          <w:t>………………</w:t>
+        </w:r>
+        <w:r>
+          <w:rPr>
+            <w:rFonts w:ascii="Segoe UI" w:hAnsi="Segoe UI" w:cs="Segoe UI"/>
+            <w:b/>
+            <w:bCs/>
+          </w:rPr>
+          <w:t>……</w:t>
+        </w:r>
+        <w:r>
+          <w:rPr>
+            <w:rFonts w:ascii="Segoe UI" w:hAnsi="Segoe UI" w:cs="Segoe UI"/>
+            <w:b/>
+            <w:bCs/>
+          </w:rPr>
+          <w:t>6</w:t>
         </w:r>
       </w:hyperlink>
     </w:p>
@@ -767,6 +818,7 @@
     </w:p>
     <w:p>
       <w:pPr>
+        <w:spacing w:line="360" w:lineRule="auto"/>
         <w:rPr>
           <w:rFonts w:ascii="Segoe UI" w:hAnsi="Segoe UI" w:cs="Segoe UI"/>
         </w:rPr>
@@ -837,7 +889,25 @@
           <w:sz w:val="24"/>
           <w:szCs w:val="24"/>
         </w:rPr>
-        <w:t>in that particular game until another challenger comes along to beat their record.</w:t>
+        <w:t xml:space="preserve">in that </w:t>
+      </w:r>
+      <w:proofErr w:type="gramStart"/>
+      <w:r>
+        <w:rPr>
+          <w:rFonts w:ascii="Segoe UI" w:hAnsi="Segoe UI" w:cs="Segoe UI"/>
+          <w:sz w:val="24"/>
+          <w:szCs w:val="24"/>
+        </w:rPr>
+        <w:t>particular game</w:t>
+      </w:r>
+      <w:proofErr w:type="gramEnd"/>
+      <w:r>
+        <w:rPr>
+          <w:rFonts w:ascii="Segoe UI" w:hAnsi="Segoe UI" w:cs="Segoe UI"/>
+          <w:sz w:val="24"/>
+          <w:szCs w:val="24"/>
+        </w:rPr>
+        <w:t xml:space="preserve"> until another challenger comes along to beat their record.</w:t>
       </w:r>
     </w:p>
     <w:p>
@@ -1227,245 +1297,1932 @@
     </w:p>
     <w:p>
       <w:pPr>
-        <w:spacing w:line="360" w:lineRule="auto"/>
+        <w:pStyle w:val="Heading1"/>
         <w:jc w:val="center"/>
         <w:rPr>
           <w:rFonts w:ascii="Segoe UI" w:hAnsi="Segoe UI" w:cs="Segoe UI"/>
-          <w:sz w:val="24"/>
-          <w:szCs w:val="24"/>
-        </w:rPr>
-      </w:pPr>
-      <w:r>
-        <w:rPr>
-          <w:rFonts w:ascii="Segoe UI" w:hAnsi="Segoe UI" w:cs="Segoe UI"/>
-          <w:b/>
-          <w:bCs/>
+          <w:b/>
+          <w:bCs/>
+          <w:color w:val="000000" w:themeColor="text1"/>
           <w:sz w:val="28"/>
           <w:szCs w:val="28"/>
         </w:rPr>
+      </w:pPr>
+      <w:r>
+        <w:rPr>
+          <w:rFonts w:ascii="Segoe UI" w:hAnsi="Segoe UI" w:cs="Segoe UI"/>
+          <w:b/>
+          <w:bCs/>
+          <w:color w:val="000000" w:themeColor="text1"/>
+          <w:sz w:val="28"/>
+          <w:szCs w:val="28"/>
+        </w:rPr>
         <w:t>Data selection</w:t>
       </w:r>
     </w:p>
-    <w:p>
-      <w:pPr>
-        <w:spacing w:line="360" w:lineRule="auto"/>
-        <w:rPr>
-          <w:rFonts w:ascii="Segoe UI" w:hAnsi="Segoe UI" w:cs="Segoe UI"/>
-          <w:sz w:val="24"/>
-          <w:szCs w:val="24"/>
-        </w:rPr>
-      </w:pPr>
-    </w:p>
-    <w:p>
-      <w:pPr>
-        <w:spacing w:line="360" w:lineRule="auto"/>
-        <w:rPr>
-          <w:rFonts w:ascii="Segoe UI" w:hAnsi="Segoe UI" w:cs="Segoe UI"/>
-          <w:sz w:val="24"/>
-          <w:szCs w:val="24"/>
-        </w:rPr>
-      </w:pPr>
-    </w:p>
-    <w:p>
-      <w:pPr>
-        <w:spacing w:line="360" w:lineRule="auto"/>
-        <w:rPr>
-          <w:rFonts w:ascii="Segoe UI" w:hAnsi="Segoe UI" w:cs="Segoe UI"/>
-          <w:sz w:val="24"/>
-          <w:szCs w:val="24"/>
-        </w:rPr>
-      </w:pPr>
-    </w:p>
-    <w:p>
-      <w:pPr>
-        <w:spacing w:line="360" w:lineRule="auto"/>
-        <w:rPr>
-          <w:rFonts w:ascii="Segoe UI" w:hAnsi="Segoe UI" w:cs="Segoe UI"/>
-          <w:sz w:val="24"/>
-          <w:szCs w:val="24"/>
-        </w:rPr>
-      </w:pPr>
-    </w:p>
-    <w:p>
-      <w:pPr>
-        <w:spacing w:line="360" w:lineRule="auto"/>
-        <w:rPr>
-          <w:rFonts w:ascii="Segoe UI" w:hAnsi="Segoe UI" w:cs="Segoe UI"/>
-          <w:sz w:val="24"/>
-          <w:szCs w:val="24"/>
-        </w:rPr>
-      </w:pPr>
-    </w:p>
-    <w:p>
-      <w:pPr>
-        <w:spacing w:line="360" w:lineRule="auto"/>
-        <w:rPr>
-          <w:rFonts w:ascii="Segoe UI" w:hAnsi="Segoe UI" w:cs="Segoe UI"/>
-          <w:sz w:val="24"/>
-          <w:szCs w:val="24"/>
-        </w:rPr>
-      </w:pPr>
-    </w:p>
-    <w:p>
-      <w:pPr>
-        <w:spacing w:line="360" w:lineRule="auto"/>
-        <w:rPr>
-          <w:rFonts w:ascii="Segoe UI" w:hAnsi="Segoe UI" w:cs="Segoe UI"/>
-          <w:sz w:val="24"/>
-          <w:szCs w:val="24"/>
-        </w:rPr>
-      </w:pPr>
-    </w:p>
-    <w:p>
-      <w:pPr>
-        <w:spacing w:line="360" w:lineRule="auto"/>
-        <w:rPr>
-          <w:rFonts w:ascii="Segoe UI" w:hAnsi="Segoe UI" w:cs="Segoe UI"/>
-          <w:sz w:val="24"/>
-          <w:szCs w:val="24"/>
-        </w:rPr>
-      </w:pPr>
-    </w:p>
-    <w:p>
-      <w:pPr>
-        <w:spacing w:line="360" w:lineRule="auto"/>
-        <w:rPr>
-          <w:rFonts w:ascii="Segoe UI" w:hAnsi="Segoe UI" w:cs="Segoe UI"/>
-          <w:sz w:val="24"/>
-          <w:szCs w:val="24"/>
-        </w:rPr>
-      </w:pPr>
-    </w:p>
-    <w:p>
-      <w:pPr>
-        <w:spacing w:line="360" w:lineRule="auto"/>
-        <w:rPr>
-          <w:rFonts w:ascii="Segoe UI" w:hAnsi="Segoe UI" w:cs="Segoe UI"/>
-          <w:sz w:val="24"/>
-          <w:szCs w:val="24"/>
-        </w:rPr>
-      </w:pPr>
-    </w:p>
-    <w:p>
-      <w:pPr>
-        <w:spacing w:line="360" w:lineRule="auto"/>
-        <w:rPr>
-          <w:rFonts w:ascii="Segoe UI" w:hAnsi="Segoe UI" w:cs="Segoe UI"/>
-          <w:sz w:val="24"/>
-          <w:szCs w:val="24"/>
-        </w:rPr>
-      </w:pPr>
-    </w:p>
-    <w:p>
-      <w:pPr>
-        <w:spacing w:line="360" w:lineRule="auto"/>
-        <w:rPr>
-          <w:rFonts w:ascii="Segoe UI" w:hAnsi="Segoe UI" w:cs="Segoe UI"/>
-          <w:sz w:val="24"/>
-          <w:szCs w:val="24"/>
-        </w:rPr>
-      </w:pPr>
-    </w:p>
-    <w:p>
-      <w:pPr>
-        <w:spacing w:line="360" w:lineRule="auto"/>
-        <w:rPr>
-          <w:rFonts w:ascii="Segoe UI" w:hAnsi="Segoe UI" w:cs="Segoe UI"/>
-          <w:sz w:val="24"/>
-          <w:szCs w:val="24"/>
-        </w:rPr>
-      </w:pPr>
-    </w:p>
-    <w:p>
-      <w:pPr>
-        <w:spacing w:line="360" w:lineRule="auto"/>
-        <w:rPr>
-          <w:rFonts w:ascii="Segoe UI" w:hAnsi="Segoe UI" w:cs="Segoe UI"/>
-          <w:sz w:val="24"/>
-          <w:szCs w:val="24"/>
-        </w:rPr>
-      </w:pPr>
-    </w:p>
-    <w:p>
-      <w:pPr>
-        <w:spacing w:line="360" w:lineRule="auto"/>
-        <w:rPr>
-          <w:rFonts w:ascii="Segoe UI" w:hAnsi="Segoe UI" w:cs="Segoe UI"/>
-          <w:sz w:val="24"/>
-          <w:szCs w:val="24"/>
-        </w:rPr>
-      </w:pPr>
-    </w:p>
-    <w:p>
-      <w:pPr>
-        <w:spacing w:line="360" w:lineRule="auto"/>
-        <w:rPr>
-          <w:rFonts w:ascii="Segoe UI" w:hAnsi="Segoe UI" w:cs="Segoe UI"/>
-          <w:sz w:val="24"/>
-          <w:szCs w:val="24"/>
-        </w:rPr>
-      </w:pPr>
-    </w:p>
-    <w:p>
-      <w:pPr>
-        <w:spacing w:line="360" w:lineRule="auto"/>
-        <w:rPr>
-          <w:rFonts w:ascii="Segoe UI" w:hAnsi="Segoe UI" w:cs="Segoe UI"/>
-          <w:sz w:val="24"/>
-          <w:szCs w:val="24"/>
-        </w:rPr>
-      </w:pPr>
-    </w:p>
-    <w:p>
-      <w:pPr>
-        <w:spacing w:line="360" w:lineRule="auto"/>
-        <w:rPr>
-          <w:rFonts w:ascii="Segoe UI" w:hAnsi="Segoe UI" w:cs="Segoe UI"/>
-          <w:sz w:val="24"/>
-          <w:szCs w:val="24"/>
-        </w:rPr>
-      </w:pPr>
-    </w:p>
-    <w:p>
-      <w:pPr>
-        <w:spacing w:line="360" w:lineRule="auto"/>
-        <w:rPr>
-          <w:rFonts w:ascii="Segoe UI" w:hAnsi="Segoe UI" w:cs="Segoe UI"/>
-          <w:sz w:val="24"/>
-          <w:szCs w:val="24"/>
-        </w:rPr>
-      </w:pPr>
-    </w:p>
-    <w:p>
-      <w:pPr>
-        <w:spacing w:line="360" w:lineRule="auto"/>
-        <w:rPr>
-          <w:rFonts w:ascii="Segoe UI" w:hAnsi="Segoe UI" w:cs="Segoe UI"/>
-          <w:sz w:val="24"/>
-          <w:szCs w:val="24"/>
-        </w:rPr>
-      </w:pPr>
-    </w:p>
-    <w:p>
-      <w:pPr>
-        <w:spacing w:line="360" w:lineRule="auto"/>
-        <w:rPr>
-          <w:rFonts w:ascii="Segoe UI" w:hAnsi="Segoe UI" w:cs="Segoe UI"/>
-          <w:sz w:val="24"/>
-          <w:szCs w:val="24"/>
-        </w:rPr>
-      </w:pPr>
-    </w:p>
-    <w:p>
-      <w:pPr>
-        <w:spacing w:line="360" w:lineRule="auto"/>
-        <w:rPr>
-          <w:rFonts w:ascii="Segoe UI" w:hAnsi="Segoe UI" w:cs="Segoe UI"/>
-          <w:sz w:val="24"/>
-          <w:szCs w:val="24"/>
-        </w:rPr>
-      </w:pPr>
-    </w:p>
+    <w:p/>
+    <w:p>
+      <w:pPr>
+        <w:spacing w:line="360" w:lineRule="auto"/>
+        <w:rPr>
+          <w:rFonts w:ascii="Segoe UI" w:hAnsi="Segoe UI" w:cs="Segoe UI"/>
+          <w:sz w:val="24"/>
+          <w:szCs w:val="24"/>
+        </w:rPr>
+      </w:pPr>
+      <w:r>
+        <w:rPr>
+          <w:rFonts w:ascii="Segoe UI" w:hAnsi="Segoe UI" w:cs="Segoe UI"/>
+          <w:sz w:val="24"/>
+          <w:szCs w:val="24"/>
+        </w:rPr>
+        <w:t xml:space="preserve">To collect data for my indicators, I consulted </w:t>
+      </w:r>
+      <w:r>
+        <w:rPr>
+          <w:rFonts w:ascii="Segoe UI" w:hAnsi="Segoe UI" w:cs="Segoe UI"/>
+          <w:b/>
+          <w:bCs/>
+          <w:sz w:val="24"/>
+          <w:szCs w:val="24"/>
+        </w:rPr>
+        <w:t>speedrun.com</w:t>
+      </w:r>
+      <w:r>
+        <w:rPr>
+          <w:rFonts w:ascii="Segoe UI" w:hAnsi="Segoe UI" w:cs="Segoe UI"/>
+          <w:b/>
+          <w:bCs/>
+          <w:sz w:val="24"/>
+          <w:szCs w:val="24"/>
+        </w:rPr>
+        <w:t xml:space="preserve">. </w:t>
+      </w:r>
+      <w:r>
+        <w:rPr>
+          <w:rFonts w:ascii="Segoe UI" w:hAnsi="Segoe UI" w:cs="Segoe UI"/>
+          <w:sz w:val="24"/>
+          <w:szCs w:val="24"/>
+        </w:rPr>
+        <w:t>Speedrun.com is the official website for world record holders. Players must record their runs, upload it to the site, and the run must be verified by an external player to receive world record status. To ensure that my index is as diverse as possible, I selected 10 games with the most total runs across 3 distinct categories</w:t>
+      </w:r>
+      <w:r>
+        <w:rPr>
+          <w:rFonts w:ascii="Segoe UI" w:hAnsi="Segoe UI" w:cs="Segoe UI"/>
+          <w:sz w:val="24"/>
+          <w:szCs w:val="24"/>
+        </w:rPr>
+        <w:t xml:space="preserve">: </w:t>
+      </w:r>
+      <w:r>
+        <w:rPr>
+          <w:rFonts w:ascii="Segoe UI" w:hAnsi="Segoe UI" w:cs="Segoe UI"/>
+          <w:sz w:val="24"/>
+          <w:szCs w:val="24"/>
+        </w:rPr>
+        <w:t>Platformer</w:t>
+      </w:r>
+      <w:r>
+        <w:rPr>
+          <w:rFonts w:ascii="Segoe UI" w:hAnsi="Segoe UI" w:cs="Segoe UI"/>
+          <w:sz w:val="24"/>
+          <w:szCs w:val="24"/>
+        </w:rPr>
+        <w:t>s</w:t>
+      </w:r>
+      <w:r>
+        <w:rPr>
+          <w:rFonts w:ascii="Segoe UI" w:hAnsi="Segoe UI" w:cs="Segoe UI"/>
+          <w:sz w:val="24"/>
+          <w:szCs w:val="24"/>
+        </w:rPr>
+        <w:t>, Role</w:t>
+      </w:r>
+      <w:r>
+        <w:rPr>
+          <w:rFonts w:ascii="Segoe UI" w:hAnsi="Segoe UI" w:cs="Segoe UI"/>
+          <w:sz w:val="24"/>
+          <w:szCs w:val="24"/>
+        </w:rPr>
+        <w:t>-</w:t>
+      </w:r>
+      <w:r>
+        <w:rPr>
+          <w:rFonts w:ascii="Segoe UI" w:hAnsi="Segoe UI" w:cs="Segoe UI"/>
+          <w:sz w:val="24"/>
+          <w:szCs w:val="24"/>
+        </w:rPr>
+        <w:t>Playing Games</w:t>
+      </w:r>
+      <w:r>
+        <w:rPr>
+          <w:rFonts w:ascii="Segoe UI" w:hAnsi="Segoe UI" w:cs="Segoe UI"/>
+          <w:sz w:val="24"/>
+          <w:szCs w:val="24"/>
+        </w:rPr>
+        <w:t xml:space="preserve"> (RPGs)</w:t>
+      </w:r>
+      <w:r>
+        <w:rPr>
+          <w:rFonts w:ascii="Segoe UI" w:hAnsi="Segoe UI" w:cs="Segoe UI"/>
+          <w:sz w:val="24"/>
+          <w:szCs w:val="24"/>
+        </w:rPr>
+        <w:t xml:space="preserve"> and First</w:t>
+      </w:r>
+      <w:r>
+        <w:rPr>
+          <w:rFonts w:ascii="Segoe UI" w:hAnsi="Segoe UI" w:cs="Segoe UI"/>
+          <w:sz w:val="24"/>
+          <w:szCs w:val="24"/>
+        </w:rPr>
+        <w:t>-</w:t>
+      </w:r>
+      <w:r>
+        <w:rPr>
+          <w:rFonts w:ascii="Segoe UI" w:hAnsi="Segoe UI" w:cs="Segoe UI"/>
+          <w:sz w:val="24"/>
+          <w:szCs w:val="24"/>
+        </w:rPr>
+        <w:t xml:space="preserve">Person </w:t>
+      </w:r>
+      <w:r>
+        <w:rPr>
+          <w:rFonts w:ascii="Segoe UI" w:hAnsi="Segoe UI" w:cs="Segoe UI"/>
+          <w:sz w:val="24"/>
+          <w:szCs w:val="24"/>
+        </w:rPr>
+        <w:t>S</w:t>
+      </w:r>
+      <w:r>
+        <w:rPr>
+          <w:rFonts w:ascii="Segoe UI" w:hAnsi="Segoe UI" w:cs="Segoe UI"/>
+          <w:sz w:val="24"/>
+          <w:szCs w:val="24"/>
+        </w:rPr>
+        <w:t>hooters</w:t>
+      </w:r>
+      <w:r>
+        <w:rPr>
+          <w:rFonts w:ascii="Segoe UI" w:hAnsi="Segoe UI" w:cs="Segoe UI"/>
+          <w:sz w:val="24"/>
+          <w:szCs w:val="24"/>
+        </w:rPr>
+        <w:t xml:space="preserve"> (FPS)</w:t>
+      </w:r>
+      <w:r>
+        <w:rPr>
+          <w:rFonts w:ascii="Segoe UI" w:hAnsi="Segoe UI" w:cs="Segoe UI"/>
+          <w:sz w:val="24"/>
+          <w:szCs w:val="24"/>
+        </w:rPr>
+        <w:t xml:space="preserve">. </w:t>
+      </w:r>
+      <w:r>
+        <w:rPr>
+          <w:rFonts w:ascii="Segoe UI" w:hAnsi="Segoe UI" w:cs="Segoe UI"/>
+          <w:sz w:val="24"/>
+          <w:szCs w:val="24"/>
+        </w:rPr>
+        <w:t xml:space="preserve">Along with my indicators I collected some categorical variables that describe other factors that influence a world record. </w:t>
+      </w:r>
+    </w:p>
+    <w:p>
+      <w:pPr>
+        <w:spacing w:line="360" w:lineRule="auto"/>
+        <w:rPr>
+          <w:rFonts w:ascii="Segoe UI" w:hAnsi="Segoe UI" w:cs="Segoe UI"/>
+          <w:b/>
+          <w:bCs/>
+          <w:sz w:val="24"/>
+          <w:szCs w:val="24"/>
+        </w:rPr>
+      </w:pPr>
+      <w:r>
+        <w:rPr>
+          <w:rFonts w:ascii="Segoe UI" w:hAnsi="Segoe UI" w:cs="Segoe UI"/>
+          <w:sz w:val="24"/>
+          <w:szCs w:val="24"/>
+        </w:rPr>
+        <w:t xml:space="preserve">These factors include </w:t>
+      </w:r>
+      <w:r>
+        <w:rPr>
+          <w:rFonts w:ascii="Segoe UI" w:hAnsi="Segoe UI" w:cs="Segoe UI"/>
+          <w:b/>
+          <w:bCs/>
+          <w:sz w:val="24"/>
+          <w:szCs w:val="24"/>
+        </w:rPr>
+        <w:t xml:space="preserve">Platform, </w:t>
+      </w:r>
+      <w:r>
+        <w:rPr>
+          <w:rFonts w:ascii="Segoe UI" w:hAnsi="Segoe UI" w:cs="Segoe UI"/>
+          <w:b/>
+          <w:bCs/>
+          <w:sz w:val="24"/>
+          <w:szCs w:val="24"/>
+        </w:rPr>
+        <w:t>RNG</w:t>
+      </w:r>
+      <w:r>
+        <w:rPr>
+          <w:rFonts w:ascii="Segoe UI" w:hAnsi="Segoe UI" w:cs="Segoe UI"/>
+          <w:b/>
+          <w:bCs/>
+          <w:sz w:val="24"/>
+          <w:szCs w:val="24"/>
+        </w:rPr>
+        <w:t>, glitches</w:t>
+      </w:r>
+      <w:r>
+        <w:rPr>
+          <w:rFonts w:ascii="Segoe UI" w:hAnsi="Segoe UI" w:cs="Segoe UI"/>
+          <w:b/>
+          <w:bCs/>
+          <w:sz w:val="24"/>
+          <w:szCs w:val="24"/>
+        </w:rPr>
+        <w:t>_</w:t>
+      </w:r>
+      <w:r>
+        <w:rPr>
+          <w:rFonts w:ascii="Segoe UI" w:hAnsi="Segoe UI" w:cs="Segoe UI"/>
+          <w:b/>
+          <w:bCs/>
+          <w:sz w:val="24"/>
+          <w:szCs w:val="24"/>
+        </w:rPr>
+        <w:t>possible, game_name and category.</w:t>
+      </w:r>
+    </w:p>
+    <w:p>
+      <w:pPr>
+        <w:spacing w:line="360" w:lineRule="auto"/>
+        <w:rPr>
+          <w:rFonts w:ascii="Segoe UI" w:hAnsi="Segoe UI" w:cs="Segoe UI"/>
+          <w:sz w:val="24"/>
+          <w:szCs w:val="24"/>
+        </w:rPr>
+      </w:pPr>
+      <w:r>
+        <w:rPr>
+          <w:rFonts w:ascii="Segoe UI" w:hAnsi="Segoe UI" w:cs="Segoe UI"/>
+          <w:sz w:val="24"/>
+          <w:szCs w:val="24"/>
+        </w:rPr>
+        <w:t>Speedrun.com provides the</w:t>
+      </w:r>
+      <w:r>
+        <w:rPr>
+          <w:rFonts w:ascii="Segoe UI" w:hAnsi="Segoe UI" w:cs="Segoe UI"/>
+          <w:sz w:val="24"/>
+          <w:szCs w:val="24"/>
+        </w:rPr>
+        <w:t xml:space="preserve"> world record time, </w:t>
+      </w:r>
+      <w:r>
+        <w:rPr>
+          <w:rFonts w:ascii="Segoe UI" w:hAnsi="Segoe UI" w:cs="Segoe UI"/>
+          <w:sz w:val="24"/>
+          <w:szCs w:val="24"/>
+        </w:rPr>
+        <w:t>the age of the record</w:t>
+      </w:r>
+      <w:r>
+        <w:rPr>
+          <w:rFonts w:ascii="Segoe UI" w:hAnsi="Segoe UI" w:cs="Segoe UI"/>
+          <w:sz w:val="24"/>
+          <w:szCs w:val="24"/>
+        </w:rPr>
+        <w:t xml:space="preserve">, </w:t>
+      </w:r>
+      <w:r>
+        <w:rPr>
+          <w:rFonts w:ascii="Segoe UI" w:hAnsi="Segoe UI" w:cs="Segoe UI"/>
+          <w:sz w:val="24"/>
+          <w:szCs w:val="24"/>
+        </w:rPr>
+        <w:t>the gaming platform used</w:t>
+      </w:r>
+      <w:r>
+        <w:rPr>
+          <w:rFonts w:ascii="Segoe UI" w:hAnsi="Segoe UI" w:cs="Segoe UI"/>
+          <w:sz w:val="24"/>
+          <w:szCs w:val="24"/>
+        </w:rPr>
+        <w:t xml:space="preserve">, total runs in the category, total active players and it allows me to calculate the margin between the world record holder and the runner-up. This allows me to gather the data for </w:t>
+      </w:r>
+      <w:r>
+        <w:rPr>
+          <w:rFonts w:ascii="Segoe UI" w:hAnsi="Segoe UI" w:cs="Segoe UI"/>
+          <w:sz w:val="24"/>
+          <w:szCs w:val="24"/>
+        </w:rPr>
+        <w:t>5</w:t>
+      </w:r>
+      <w:r>
+        <w:rPr>
+          <w:rFonts w:ascii="Segoe UI" w:hAnsi="Segoe UI" w:cs="Segoe UI"/>
+          <w:sz w:val="24"/>
+          <w:szCs w:val="24"/>
+        </w:rPr>
+        <w:t xml:space="preserve"> out of 6 of our indicators for the index. To retrieve data for </w:t>
+      </w:r>
+      <w:r>
+        <w:rPr>
+          <w:rFonts w:ascii="Segoe UI" w:hAnsi="Segoe UI" w:cs="Segoe UI"/>
+          <w:b/>
+          <w:bCs/>
+          <w:sz w:val="24"/>
+          <w:szCs w:val="24"/>
+        </w:rPr>
+        <w:t>casual_completion</w:t>
+      </w:r>
+      <w:r>
+        <w:rPr>
+          <w:rFonts w:ascii="Segoe UI" w:hAnsi="Segoe UI" w:cs="Segoe UI"/>
+          <w:sz w:val="24"/>
+          <w:szCs w:val="24"/>
+        </w:rPr>
+        <w:t xml:space="preserve">, I consulted </w:t>
+      </w:r>
+      <w:r>
+        <w:rPr>
+          <w:rFonts w:ascii="Segoe UI" w:hAnsi="Segoe UI" w:cs="Segoe UI"/>
+          <w:b/>
+          <w:bCs/>
+          <w:sz w:val="24"/>
+          <w:szCs w:val="24"/>
+        </w:rPr>
+        <w:t>howlongtobeat.com</w:t>
+      </w:r>
+      <w:r>
+        <w:rPr>
+          <w:rFonts w:ascii="Segoe UI" w:hAnsi="Segoe UI" w:cs="Segoe UI"/>
+          <w:sz w:val="24"/>
+          <w:szCs w:val="24"/>
+        </w:rPr>
+        <w:t>. This website calculates how long it takes the average player to beat a video game, voted by players. This indicator displays the optimisation performed by speedrunners from the average completion time to the current world</w:t>
+      </w:r>
+      <w:r>
+        <w:rPr>
+          <w:rFonts w:ascii="Segoe UI" w:hAnsi="Segoe UI" w:cs="Segoe UI"/>
+          <w:sz w:val="24"/>
+          <w:szCs w:val="24"/>
+        </w:rPr>
+        <w:t xml:space="preserve"> record</w:t>
+      </w:r>
+      <w:r>
+        <w:rPr>
+          <w:rFonts w:ascii="Segoe UI" w:hAnsi="Segoe UI" w:cs="Segoe UI"/>
+          <w:sz w:val="24"/>
+          <w:szCs w:val="24"/>
+        </w:rPr>
+        <w:t xml:space="preserve">. </w:t>
+      </w:r>
+    </w:p>
+    <w:p>
+      <w:pPr>
+        <w:spacing w:line="360" w:lineRule="auto"/>
+        <w:rPr>
+          <w:rFonts w:ascii="Segoe UI" w:hAnsi="Segoe UI" w:cs="Segoe UI"/>
+          <w:sz w:val="24"/>
+          <w:szCs w:val="24"/>
+        </w:rPr>
+      </w:pPr>
+    </w:p>
+    <w:p>
+      <w:pPr>
+        <w:spacing w:line="360" w:lineRule="auto"/>
+        <w:rPr>
+          <w:rFonts w:ascii="Segoe UI" w:hAnsi="Segoe UI" w:cs="Segoe UI"/>
+          <w:sz w:val="24"/>
+          <w:szCs w:val="24"/>
+        </w:rPr>
+      </w:pPr>
+      <w:r>
+        <w:rPr>
+          <w:rFonts w:ascii="Segoe UI" w:hAnsi="Segoe UI" w:cs="Segoe UI"/>
+          <w:sz w:val="24"/>
+          <w:szCs w:val="24"/>
+        </w:rPr>
+        <w:t xml:space="preserve">Platform, game_name and category variables were collected from speedrun.com. The game name will identify which of the 30 games is the most difficult to achieve a world record in. The platform identifies what console the world record holder was </w:t>
+      </w:r>
+      <w:r>
+        <w:rPr>
+          <w:rFonts w:ascii="Segoe UI" w:hAnsi="Segoe UI" w:cs="Segoe UI"/>
+          <w:sz w:val="24"/>
+          <w:szCs w:val="24"/>
+        </w:rPr>
+        <w:lastRenderedPageBreak/>
+        <w:t xml:space="preserve">using, there are differences between how a console/PC operates so this is an important factor to consider. The category displays which of the 3 categories the game belongs to. For </w:t>
+      </w:r>
+      <w:r>
+        <w:rPr>
+          <w:rFonts w:ascii="Segoe UI" w:hAnsi="Segoe UI" w:cs="Segoe UI"/>
+          <w:b/>
+          <w:bCs/>
+          <w:sz w:val="24"/>
+          <w:szCs w:val="24"/>
+        </w:rPr>
+        <w:t>glitches_possible</w:t>
+      </w:r>
+      <w:r>
+        <w:rPr>
+          <w:rFonts w:ascii="Segoe UI" w:hAnsi="Segoe UI" w:cs="Segoe UI"/>
+          <w:sz w:val="24"/>
+          <w:szCs w:val="24"/>
+        </w:rPr>
+        <w:t xml:space="preserve"> and </w:t>
+      </w:r>
+      <w:r>
+        <w:rPr>
+          <w:rFonts w:ascii="Segoe UI" w:hAnsi="Segoe UI" w:cs="Segoe UI"/>
+          <w:b/>
+          <w:bCs/>
+          <w:sz w:val="24"/>
+          <w:szCs w:val="24"/>
+        </w:rPr>
+        <w:t>RNG</w:t>
+      </w:r>
+      <w:r>
+        <w:rPr>
+          <w:rFonts w:ascii="Segoe UI" w:hAnsi="Segoe UI" w:cs="Segoe UI"/>
+          <w:b/>
+          <w:bCs/>
+          <w:sz w:val="24"/>
+          <w:szCs w:val="24"/>
+        </w:rPr>
+        <w:t xml:space="preserve">, </w:t>
+      </w:r>
+      <w:r>
+        <w:rPr>
+          <w:rFonts w:ascii="Segoe UI" w:hAnsi="Segoe UI" w:cs="Segoe UI"/>
+          <w:sz w:val="24"/>
+          <w:szCs w:val="24"/>
+        </w:rPr>
+        <w:t xml:space="preserve">I consulted speedrunning attempts from youtube.com. These categorical variables will demonstrate the influence the game has over a speedrun. The glitches_possible variables highlights if the speedrunner is using any tricks that manipulate the game in an unintentional way so that they can achieve a quicker time. An example of this is pushing their character through a wall by jumping at a certain angle, creating a shortcut by manipulating the environment. </w:t>
+      </w:r>
+      <w:r>
+        <w:rPr>
+          <w:rFonts w:ascii="Segoe UI" w:hAnsi="Segoe UI" w:cs="Segoe UI"/>
+          <w:b/>
+          <w:bCs/>
+          <w:sz w:val="24"/>
+          <w:szCs w:val="24"/>
+        </w:rPr>
+        <w:t xml:space="preserve">RNG </w:t>
+      </w:r>
+      <w:r>
+        <w:rPr>
+          <w:rFonts w:ascii="Segoe UI" w:hAnsi="Segoe UI" w:cs="Segoe UI"/>
+          <w:sz w:val="24"/>
+          <w:szCs w:val="24"/>
+        </w:rPr>
+        <w:t xml:space="preserve">stands for random number generation and represents environmental factors that are present in certain games. There is no official </w:t>
+      </w:r>
+      <w:r>
+        <w:rPr>
+          <w:rFonts w:ascii="Segoe UI" w:hAnsi="Segoe UI" w:cs="Segoe UI"/>
+          <w:sz w:val="24"/>
+          <w:szCs w:val="24"/>
+        </w:rPr>
+        <w:t>metric</w:t>
+      </w:r>
+      <w:r>
+        <w:rPr>
+          <w:rFonts w:ascii="Segoe UI" w:hAnsi="Segoe UI" w:cs="Segoe UI"/>
+          <w:sz w:val="24"/>
+          <w:szCs w:val="24"/>
+        </w:rPr>
+        <w:t xml:space="preserve"> for </w:t>
+      </w:r>
+      <w:r>
+        <w:rPr>
+          <w:rFonts w:ascii="Segoe UI" w:hAnsi="Segoe UI" w:cs="Segoe UI"/>
+          <w:b/>
+          <w:bCs/>
+          <w:sz w:val="24"/>
+          <w:szCs w:val="24"/>
+        </w:rPr>
+        <w:t>RNG,</w:t>
+      </w:r>
+      <w:r>
+        <w:rPr>
+          <w:rFonts w:ascii="Segoe UI" w:hAnsi="Segoe UI" w:cs="Segoe UI"/>
+          <w:sz w:val="24"/>
+          <w:szCs w:val="24"/>
+        </w:rPr>
+        <w:t xml:space="preserve"> but it is a crucial variable to record as it highly influences a speedrun. If a game has </w:t>
+      </w:r>
+      <w:r>
+        <w:rPr>
+          <w:rFonts w:ascii="Segoe UI" w:hAnsi="Segoe UI" w:cs="Segoe UI"/>
+          <w:b/>
+          <w:bCs/>
+          <w:sz w:val="24"/>
+          <w:szCs w:val="24"/>
+        </w:rPr>
+        <w:t xml:space="preserve">no </w:t>
+      </w:r>
+      <w:r>
+        <w:rPr>
+          <w:rFonts w:ascii="Segoe UI" w:hAnsi="Segoe UI" w:cs="Segoe UI"/>
+          <w:b/>
+          <w:bCs/>
+          <w:sz w:val="24"/>
+          <w:szCs w:val="24"/>
+        </w:rPr>
+        <w:t>RNG,</w:t>
+      </w:r>
+      <w:r>
+        <w:rPr>
+          <w:rFonts w:ascii="Segoe UI" w:hAnsi="Segoe UI" w:cs="Segoe UI"/>
+          <w:b/>
+          <w:bCs/>
+          <w:sz w:val="24"/>
+          <w:szCs w:val="24"/>
+        </w:rPr>
+        <w:t xml:space="preserve"> </w:t>
+      </w:r>
+      <w:r>
+        <w:rPr>
+          <w:rFonts w:ascii="Segoe UI" w:hAnsi="Segoe UI" w:cs="Segoe UI"/>
+          <w:sz w:val="24"/>
+          <w:szCs w:val="24"/>
+        </w:rPr>
+        <w:t>this means</w:t>
+      </w:r>
+      <w:r>
+        <w:rPr>
+          <w:rFonts w:ascii="Segoe UI" w:hAnsi="Segoe UI" w:cs="Segoe UI"/>
+          <w:sz w:val="24"/>
+          <w:szCs w:val="24"/>
+        </w:rPr>
+        <w:t xml:space="preserve"> that a speedrun is </w:t>
+      </w:r>
+      <w:r>
+        <w:rPr>
+          <w:rFonts w:ascii="Segoe UI" w:hAnsi="Segoe UI" w:cs="Segoe UI"/>
+          <w:sz w:val="24"/>
+          <w:szCs w:val="24"/>
+        </w:rPr>
+        <w:t>entirely reliant on human expertise</w:t>
+      </w:r>
+      <w:r>
+        <w:rPr>
+          <w:rFonts w:ascii="Segoe UI" w:hAnsi="Segoe UI" w:cs="Segoe UI"/>
+          <w:sz w:val="24"/>
+          <w:szCs w:val="24"/>
+        </w:rPr>
+        <w:t xml:space="preserve"> and doesn’t rely on in-game values to complete a run. </w:t>
+      </w:r>
+      <w:r>
+        <w:rPr>
+          <w:rFonts w:ascii="Segoe UI" w:hAnsi="Segoe UI" w:cs="Segoe UI"/>
+          <w:sz w:val="24"/>
+          <w:szCs w:val="24"/>
+        </w:rPr>
+        <w:t xml:space="preserve">A game with </w:t>
+      </w:r>
+      <w:r>
+        <w:rPr>
+          <w:rFonts w:ascii="Segoe UI" w:hAnsi="Segoe UI" w:cs="Segoe UI"/>
+          <w:b/>
+          <w:bCs/>
+          <w:sz w:val="24"/>
+          <w:szCs w:val="24"/>
+        </w:rPr>
+        <w:t xml:space="preserve">low </w:t>
+      </w:r>
+      <w:r>
+        <w:rPr>
+          <w:rFonts w:ascii="Segoe UI" w:hAnsi="Segoe UI" w:cs="Segoe UI"/>
+          <w:b/>
+          <w:bCs/>
+          <w:sz w:val="24"/>
+          <w:szCs w:val="24"/>
+        </w:rPr>
+        <w:t>RNG</w:t>
+      </w:r>
+      <w:r>
+        <w:rPr>
+          <w:rFonts w:ascii="Segoe UI" w:hAnsi="Segoe UI" w:cs="Segoe UI"/>
+          <w:sz w:val="24"/>
+          <w:szCs w:val="24"/>
+        </w:rPr>
+        <w:t xml:space="preserve"> means that a speedrun relies on enemy patterns and if an enemy acts in a way that has been unaccounted for, the run must restart. A</w:t>
+      </w:r>
+      <w:r>
+        <w:rPr>
+          <w:rFonts w:ascii="Segoe UI" w:hAnsi="Segoe UI" w:cs="Segoe UI"/>
+          <w:sz w:val="24"/>
+          <w:szCs w:val="24"/>
+        </w:rPr>
+        <w:t xml:space="preserve"> </w:t>
+      </w:r>
+      <w:r>
+        <w:rPr>
+          <w:rFonts w:ascii="Segoe UI" w:hAnsi="Segoe UI" w:cs="Segoe UI"/>
+          <w:b/>
+          <w:bCs/>
+          <w:sz w:val="24"/>
+          <w:szCs w:val="24"/>
+        </w:rPr>
+        <w:t xml:space="preserve">high </w:t>
+      </w:r>
+      <w:r>
+        <w:rPr>
+          <w:rFonts w:ascii="Segoe UI" w:hAnsi="Segoe UI" w:cs="Segoe UI"/>
+          <w:b/>
+          <w:bCs/>
+          <w:sz w:val="24"/>
+          <w:szCs w:val="24"/>
+        </w:rPr>
+        <w:t>RNG</w:t>
+      </w:r>
+      <w:r>
+        <w:rPr>
+          <w:rFonts w:ascii="Segoe UI" w:hAnsi="Segoe UI" w:cs="Segoe UI"/>
+          <w:b/>
+          <w:bCs/>
+          <w:sz w:val="24"/>
+          <w:szCs w:val="24"/>
+        </w:rPr>
+        <w:t xml:space="preserve"> </w:t>
+      </w:r>
+      <w:r>
+        <w:rPr>
+          <w:rFonts w:ascii="Segoe UI" w:hAnsi="Segoe UI" w:cs="Segoe UI"/>
+          <w:sz w:val="24"/>
+          <w:szCs w:val="24"/>
+        </w:rPr>
+        <w:t xml:space="preserve">means that the run is </w:t>
+      </w:r>
+      <w:r>
+        <w:rPr>
+          <w:rFonts w:ascii="Segoe UI" w:hAnsi="Segoe UI" w:cs="Segoe UI"/>
+          <w:b/>
+          <w:bCs/>
+          <w:sz w:val="24"/>
+          <w:szCs w:val="24"/>
+        </w:rPr>
+        <w:t>entirely</w:t>
+      </w:r>
+      <w:r>
+        <w:rPr>
+          <w:rFonts w:ascii="Segoe UI" w:hAnsi="Segoe UI" w:cs="Segoe UI"/>
+          <w:sz w:val="24"/>
+          <w:szCs w:val="24"/>
+        </w:rPr>
+        <w:t xml:space="preserve"> </w:t>
+      </w:r>
+      <w:r>
+        <w:rPr>
+          <w:rFonts w:ascii="Segoe UI" w:hAnsi="Segoe UI" w:cs="Segoe UI"/>
+          <w:b/>
+          <w:bCs/>
+          <w:sz w:val="24"/>
+          <w:szCs w:val="24"/>
+        </w:rPr>
+        <w:t>dependent</w:t>
+      </w:r>
+      <w:r>
+        <w:rPr>
+          <w:rFonts w:ascii="Segoe UI" w:hAnsi="Segoe UI" w:cs="Segoe UI"/>
+          <w:sz w:val="24"/>
+          <w:szCs w:val="24"/>
+        </w:rPr>
+        <w:t xml:space="preserve"> on in-game features such as item generation</w:t>
+      </w:r>
+      <w:r>
+        <w:rPr>
+          <w:rFonts w:ascii="Segoe UI" w:hAnsi="Segoe UI" w:cs="Segoe UI"/>
+          <w:sz w:val="24"/>
+          <w:szCs w:val="24"/>
+        </w:rPr>
+        <w:t>,</w:t>
+      </w:r>
+      <w:r>
+        <w:rPr>
+          <w:rFonts w:ascii="Segoe UI" w:hAnsi="Segoe UI" w:cs="Segoe UI"/>
+          <w:sz w:val="24"/>
+          <w:szCs w:val="24"/>
+        </w:rPr>
+        <w:t xml:space="preserve"> enemy behaviour</w:t>
+      </w:r>
+      <w:r>
+        <w:rPr>
+          <w:rFonts w:ascii="Segoe UI" w:hAnsi="Segoe UI" w:cs="Segoe UI"/>
+          <w:sz w:val="24"/>
+          <w:szCs w:val="24"/>
+        </w:rPr>
+        <w:t xml:space="preserve"> or level generation</w:t>
+      </w:r>
+      <w:r>
+        <w:rPr>
+          <w:rFonts w:ascii="Segoe UI" w:hAnsi="Segoe UI" w:cs="Segoe UI"/>
+          <w:sz w:val="24"/>
+          <w:szCs w:val="24"/>
+        </w:rPr>
+        <w:t>. If the ideal scenario is not generated by the game, the run must restart.</w:t>
+      </w:r>
+    </w:p>
+    <w:tbl>
+      <w:tblPr>
+        <w:tblStyle w:val="TableGrid"/>
+        <w:tblW w:w="9351" w:type="dxa"/>
+        <w:tblLook w:val="04A0" w:firstRow="1" w:lastRow="0" w:firstColumn="1" w:lastColumn="0" w:noHBand="0" w:noVBand="1"/>
+      </w:tblPr>
+      <w:tblGrid>
+        <w:gridCol w:w="2842"/>
+        <w:gridCol w:w="1686"/>
+        <w:gridCol w:w="2105"/>
+        <w:gridCol w:w="2718"/>
+      </w:tblGrid>
+      <w:tr>
+        <w:trPr>
+          <w:trHeight w:val="443"/>
+        </w:trPr>
+        <w:tc>
+          <w:tcPr>
+            <w:tcW w:w="2842" w:type="dxa"/>
+          </w:tcPr>
+          <w:p>
+            <w:pPr>
+              <w:spacing w:line="276" w:lineRule="auto"/>
+              <w:rPr>
+                <w:rFonts w:ascii="Segoe UI" w:hAnsi="Segoe UI" w:cs="Segoe UI"/>
+                <w:b/>
+                <w:bCs/>
+                <w:sz w:val="24"/>
+                <w:szCs w:val="24"/>
+              </w:rPr>
+            </w:pPr>
+            <w:r>
+              <w:rPr>
+                <w:rFonts w:ascii="Segoe UI" w:hAnsi="Segoe UI" w:cs="Segoe UI"/>
+                <w:b/>
+                <w:bCs/>
+                <w:sz w:val="24"/>
+                <w:szCs w:val="24"/>
+              </w:rPr>
+              <w:t>Variables</w:t>
+            </w:r>
+          </w:p>
+        </w:tc>
+        <w:tc>
+          <w:tcPr>
+            <w:tcW w:w="1686" w:type="dxa"/>
+          </w:tcPr>
+          <w:p>
+            <w:pPr>
+              <w:spacing w:line="276" w:lineRule="auto"/>
+              <w:rPr>
+                <w:rFonts w:ascii="Segoe UI" w:hAnsi="Segoe UI" w:cs="Segoe UI"/>
+                <w:b/>
+                <w:bCs/>
+                <w:sz w:val="24"/>
+                <w:szCs w:val="24"/>
+              </w:rPr>
+            </w:pPr>
+            <w:r>
+              <w:rPr>
+                <w:rFonts w:ascii="Segoe UI" w:hAnsi="Segoe UI" w:cs="Segoe UI"/>
+                <w:b/>
+                <w:bCs/>
+                <w:sz w:val="24"/>
+                <w:szCs w:val="24"/>
+              </w:rPr>
+              <w:t>Type</w:t>
+            </w:r>
+          </w:p>
+        </w:tc>
+        <w:tc>
+          <w:tcPr>
+            <w:tcW w:w="2105" w:type="dxa"/>
+          </w:tcPr>
+          <w:p>
+            <w:pPr>
+              <w:spacing w:line="276" w:lineRule="auto"/>
+              <w:rPr>
+                <w:rFonts w:ascii="Segoe UI" w:hAnsi="Segoe UI" w:cs="Segoe UI"/>
+                <w:b/>
+                <w:bCs/>
+                <w:sz w:val="24"/>
+                <w:szCs w:val="24"/>
+              </w:rPr>
+            </w:pPr>
+            <w:r>
+              <w:rPr>
+                <w:rFonts w:ascii="Segoe UI" w:hAnsi="Segoe UI" w:cs="Segoe UI"/>
+                <w:b/>
+                <w:bCs/>
+                <w:sz w:val="24"/>
+                <w:szCs w:val="24"/>
+              </w:rPr>
+              <w:t>Role</w:t>
+            </w:r>
+          </w:p>
+        </w:tc>
+        <w:tc>
+          <w:tcPr>
+            <w:tcW w:w="2718" w:type="dxa"/>
+          </w:tcPr>
+          <w:p>
+            <w:pPr>
+              <w:spacing w:line="276" w:lineRule="auto"/>
+              <w:rPr>
+                <w:rFonts w:ascii="Segoe UI" w:hAnsi="Segoe UI" w:cs="Segoe UI"/>
+                <w:b/>
+                <w:bCs/>
+                <w:sz w:val="24"/>
+                <w:szCs w:val="24"/>
+              </w:rPr>
+            </w:pPr>
+            <w:r>
+              <w:rPr>
+                <w:rFonts w:ascii="Segoe UI" w:hAnsi="Segoe UI" w:cs="Segoe UI"/>
+                <w:b/>
+                <w:bCs/>
+                <w:sz w:val="24"/>
+                <w:szCs w:val="24"/>
+              </w:rPr>
+              <w:t>Location</w:t>
+            </w:r>
+          </w:p>
+        </w:tc>
+      </w:tr>
+      <w:tr>
+        <w:trPr>
+          <w:trHeight w:val="443"/>
+        </w:trPr>
+        <w:tc>
+          <w:tcPr>
+            <w:tcW w:w="2842" w:type="dxa"/>
+          </w:tcPr>
+          <w:p>
+            <w:pPr>
+              <w:spacing w:line="276" w:lineRule="auto"/>
+              <w:rPr>
+                <w:rFonts w:ascii="Segoe UI" w:hAnsi="Segoe UI" w:cs="Segoe UI"/>
+                <w:sz w:val="24"/>
+                <w:szCs w:val="24"/>
+              </w:rPr>
+            </w:pPr>
+            <w:r>
+              <w:rPr>
+                <w:rFonts w:ascii="Segoe UI" w:hAnsi="Segoe UI" w:cs="Segoe UI"/>
+                <w:sz w:val="24"/>
+                <w:szCs w:val="24"/>
+              </w:rPr>
+              <w:t>Game_name</w:t>
+            </w:r>
+          </w:p>
+        </w:tc>
+        <w:tc>
+          <w:tcPr>
+            <w:tcW w:w="1686" w:type="dxa"/>
+          </w:tcPr>
+          <w:p>
+            <w:pPr>
+              <w:spacing w:line="276" w:lineRule="auto"/>
+              <w:rPr>
+                <w:rFonts w:ascii="Segoe UI" w:hAnsi="Segoe UI" w:cs="Segoe UI"/>
+                <w:sz w:val="24"/>
+                <w:szCs w:val="24"/>
+              </w:rPr>
+            </w:pPr>
+            <w:r>
+              <w:rPr>
+                <w:rFonts w:ascii="Segoe UI" w:hAnsi="Segoe UI" w:cs="Segoe UI"/>
+                <w:sz w:val="24"/>
+                <w:szCs w:val="24"/>
+              </w:rPr>
+              <w:t>Categorical</w:t>
+            </w:r>
+          </w:p>
+        </w:tc>
+        <w:tc>
+          <w:tcPr>
+            <w:tcW w:w="2105" w:type="dxa"/>
+          </w:tcPr>
+          <w:p>
+            <w:pPr>
+              <w:spacing w:line="276" w:lineRule="auto"/>
+              <w:rPr>
+                <w:rFonts w:ascii="Segoe UI" w:hAnsi="Segoe UI" w:cs="Segoe UI"/>
+                <w:sz w:val="24"/>
+                <w:szCs w:val="24"/>
+              </w:rPr>
+            </w:pPr>
+            <w:r>
+              <w:rPr>
+                <w:rFonts w:ascii="Segoe UI" w:hAnsi="Segoe UI" w:cs="Segoe UI"/>
+                <w:sz w:val="24"/>
+                <w:szCs w:val="24"/>
+              </w:rPr>
+              <w:t>Not relevant</w:t>
+            </w:r>
+          </w:p>
+        </w:tc>
+        <w:tc>
+          <w:tcPr>
+            <w:tcW w:w="2718" w:type="dxa"/>
+          </w:tcPr>
+          <w:p>
+            <w:pPr>
+              <w:spacing w:line="276" w:lineRule="auto"/>
+              <w:rPr>
+                <w:rFonts w:ascii="Segoe UI" w:hAnsi="Segoe UI" w:cs="Segoe UI"/>
+                <w:sz w:val="24"/>
+                <w:szCs w:val="24"/>
+              </w:rPr>
+            </w:pPr>
+            <w:r>
+              <w:rPr>
+                <w:rFonts w:ascii="Segoe UI" w:hAnsi="Segoe UI" w:cs="Segoe UI"/>
+                <w:sz w:val="24"/>
+                <w:szCs w:val="24"/>
+              </w:rPr>
+              <w:t>Speedrun.com</w:t>
+            </w:r>
+          </w:p>
+        </w:tc>
+      </w:tr>
+      <w:tr>
+        <w:trPr>
+          <w:trHeight w:val="443"/>
+        </w:trPr>
+        <w:tc>
+          <w:tcPr>
+            <w:tcW w:w="2842" w:type="dxa"/>
+          </w:tcPr>
+          <w:p>
+            <w:pPr>
+              <w:spacing w:line="276" w:lineRule="auto"/>
+              <w:rPr>
+                <w:rFonts w:ascii="Segoe UI" w:hAnsi="Segoe UI" w:cs="Segoe UI"/>
+                <w:sz w:val="24"/>
+                <w:szCs w:val="24"/>
+              </w:rPr>
+            </w:pPr>
+            <w:r>
+              <w:rPr>
+                <w:rFonts w:ascii="Segoe UI" w:hAnsi="Segoe UI" w:cs="Segoe UI"/>
+                <w:sz w:val="24"/>
+                <w:szCs w:val="24"/>
+              </w:rPr>
+              <w:t>Total_Runs</w:t>
+            </w:r>
+          </w:p>
+        </w:tc>
+        <w:tc>
+          <w:tcPr>
+            <w:tcW w:w="1686" w:type="dxa"/>
+          </w:tcPr>
+          <w:p>
+            <w:pPr>
+              <w:spacing w:line="276" w:lineRule="auto"/>
+              <w:rPr>
+                <w:rFonts w:ascii="Segoe UI" w:hAnsi="Segoe UI" w:cs="Segoe UI"/>
+                <w:sz w:val="24"/>
+                <w:szCs w:val="24"/>
+              </w:rPr>
+            </w:pPr>
+            <w:r>
+              <w:rPr>
+                <w:rFonts w:ascii="Segoe UI" w:hAnsi="Segoe UI" w:cs="Segoe UI"/>
+                <w:sz w:val="24"/>
+                <w:szCs w:val="24"/>
+              </w:rPr>
+              <w:t>Numerical</w:t>
+            </w:r>
+          </w:p>
+        </w:tc>
+        <w:tc>
+          <w:tcPr>
+            <w:tcW w:w="2105" w:type="dxa"/>
+          </w:tcPr>
+          <w:p>
+            <w:pPr>
+              <w:spacing w:line="276" w:lineRule="auto"/>
+              <w:rPr>
+                <w:rFonts w:ascii="Segoe UI" w:hAnsi="Segoe UI" w:cs="Segoe UI"/>
+                <w:sz w:val="24"/>
+                <w:szCs w:val="24"/>
+              </w:rPr>
+            </w:pPr>
+            <w:r>
+              <w:rPr>
+                <w:rFonts w:ascii="Segoe UI" w:hAnsi="Segoe UI" w:cs="Segoe UI"/>
+                <w:sz w:val="24"/>
+                <w:szCs w:val="24"/>
+              </w:rPr>
+              <w:t>Explanatory</w:t>
+            </w:r>
+          </w:p>
+        </w:tc>
+        <w:tc>
+          <w:tcPr>
+            <w:tcW w:w="2718" w:type="dxa"/>
+          </w:tcPr>
+          <w:p>
+            <w:pPr>
+              <w:spacing w:line="276" w:lineRule="auto"/>
+              <w:rPr>
+                <w:rFonts w:ascii="Segoe UI" w:hAnsi="Segoe UI" w:cs="Segoe UI"/>
+                <w:sz w:val="24"/>
+                <w:szCs w:val="24"/>
+              </w:rPr>
+            </w:pPr>
+            <w:r>
+              <w:rPr>
+                <w:rFonts w:ascii="Segoe UI" w:hAnsi="Segoe UI" w:cs="Segoe UI"/>
+                <w:sz w:val="24"/>
+                <w:szCs w:val="24"/>
+              </w:rPr>
+              <w:t>Speedrun.com</w:t>
+            </w:r>
+          </w:p>
+        </w:tc>
+      </w:tr>
+      <w:tr>
+        <w:trPr>
+          <w:trHeight w:val="462"/>
+        </w:trPr>
+        <w:tc>
+          <w:tcPr>
+            <w:tcW w:w="2842" w:type="dxa"/>
+          </w:tcPr>
+          <w:p>
+            <w:pPr>
+              <w:spacing w:line="276" w:lineRule="auto"/>
+              <w:rPr>
+                <w:rFonts w:ascii="Segoe UI" w:hAnsi="Segoe UI" w:cs="Segoe UI"/>
+                <w:sz w:val="24"/>
+                <w:szCs w:val="24"/>
+              </w:rPr>
+            </w:pPr>
+            <w:r>
+              <w:rPr>
+                <w:rFonts w:ascii="Segoe UI" w:hAnsi="Segoe UI" w:cs="Segoe UI"/>
+                <w:sz w:val="24"/>
+                <w:szCs w:val="24"/>
+              </w:rPr>
+              <w:t>World_record_time</w:t>
+            </w:r>
+          </w:p>
+        </w:tc>
+        <w:tc>
+          <w:tcPr>
+            <w:tcW w:w="1686" w:type="dxa"/>
+          </w:tcPr>
+          <w:p>
+            <w:pPr>
+              <w:spacing w:line="276" w:lineRule="auto"/>
+              <w:rPr>
+                <w:rFonts w:ascii="Segoe UI" w:hAnsi="Segoe UI" w:cs="Segoe UI"/>
+                <w:sz w:val="24"/>
+                <w:szCs w:val="24"/>
+              </w:rPr>
+            </w:pPr>
+            <w:r>
+              <w:rPr>
+                <w:rFonts w:ascii="Segoe UI" w:hAnsi="Segoe UI" w:cs="Segoe UI"/>
+                <w:sz w:val="24"/>
+                <w:szCs w:val="24"/>
+              </w:rPr>
+              <w:t>Numerical</w:t>
+            </w:r>
+          </w:p>
+        </w:tc>
+        <w:tc>
+          <w:tcPr>
+            <w:tcW w:w="2105" w:type="dxa"/>
+          </w:tcPr>
+          <w:p>
+            <w:pPr>
+              <w:spacing w:line="276" w:lineRule="auto"/>
+              <w:rPr>
+                <w:rFonts w:ascii="Segoe UI" w:hAnsi="Segoe UI" w:cs="Segoe UI"/>
+                <w:sz w:val="24"/>
+                <w:szCs w:val="24"/>
+              </w:rPr>
+            </w:pPr>
+            <w:r>
+              <w:rPr>
+                <w:rFonts w:ascii="Segoe UI" w:hAnsi="Segoe UI" w:cs="Segoe UI"/>
+                <w:sz w:val="24"/>
+                <w:szCs w:val="24"/>
+              </w:rPr>
+              <w:t>Explanatory</w:t>
+            </w:r>
+          </w:p>
+        </w:tc>
+        <w:tc>
+          <w:tcPr>
+            <w:tcW w:w="2718" w:type="dxa"/>
+          </w:tcPr>
+          <w:p>
+            <w:pPr>
+              <w:spacing w:line="276" w:lineRule="auto"/>
+              <w:rPr>
+                <w:rFonts w:ascii="Segoe UI" w:hAnsi="Segoe UI" w:cs="Segoe UI"/>
+                <w:sz w:val="24"/>
+                <w:szCs w:val="24"/>
+              </w:rPr>
+            </w:pPr>
+            <w:r>
+              <w:rPr>
+                <w:rFonts w:ascii="Segoe UI" w:hAnsi="Segoe UI" w:cs="Segoe UI"/>
+                <w:sz w:val="24"/>
+                <w:szCs w:val="24"/>
+              </w:rPr>
+              <w:t>Speedrun.com</w:t>
+            </w:r>
+          </w:p>
+        </w:tc>
+      </w:tr>
+      <w:tr>
+        <w:trPr>
+          <w:trHeight w:val="443"/>
+        </w:trPr>
+        <w:tc>
+          <w:tcPr>
+            <w:tcW w:w="2842" w:type="dxa"/>
+          </w:tcPr>
+          <w:p>
+            <w:pPr>
+              <w:spacing w:line="276" w:lineRule="auto"/>
+              <w:rPr>
+                <w:rFonts w:ascii="Segoe UI" w:hAnsi="Segoe UI" w:cs="Segoe UI"/>
+                <w:sz w:val="24"/>
+                <w:szCs w:val="24"/>
+              </w:rPr>
+            </w:pPr>
+            <w:r>
+              <w:rPr>
+                <w:rFonts w:ascii="Segoe UI" w:hAnsi="Segoe UI" w:cs="Segoe UI"/>
+                <w:sz w:val="24"/>
+                <w:szCs w:val="24"/>
+              </w:rPr>
+              <w:t>World_record_age</w:t>
+            </w:r>
+          </w:p>
+        </w:tc>
+        <w:tc>
+          <w:tcPr>
+            <w:tcW w:w="1686" w:type="dxa"/>
+          </w:tcPr>
+          <w:p>
+            <w:pPr>
+              <w:spacing w:line="276" w:lineRule="auto"/>
+              <w:rPr>
+                <w:rFonts w:ascii="Segoe UI" w:hAnsi="Segoe UI" w:cs="Segoe UI"/>
+                <w:sz w:val="24"/>
+                <w:szCs w:val="24"/>
+              </w:rPr>
+            </w:pPr>
+            <w:r>
+              <w:rPr>
+                <w:rFonts w:ascii="Segoe UI" w:hAnsi="Segoe UI" w:cs="Segoe UI"/>
+                <w:sz w:val="24"/>
+                <w:szCs w:val="24"/>
+              </w:rPr>
+              <w:t>Numerical</w:t>
+            </w:r>
+          </w:p>
+        </w:tc>
+        <w:tc>
+          <w:tcPr>
+            <w:tcW w:w="2105" w:type="dxa"/>
+          </w:tcPr>
+          <w:p>
+            <w:pPr>
+              <w:spacing w:line="276" w:lineRule="auto"/>
+              <w:rPr>
+                <w:rFonts w:ascii="Segoe UI" w:hAnsi="Segoe UI" w:cs="Segoe UI"/>
+                <w:sz w:val="24"/>
+                <w:szCs w:val="24"/>
+              </w:rPr>
+            </w:pPr>
+            <w:r>
+              <w:rPr>
+                <w:rFonts w:ascii="Segoe UI" w:hAnsi="Segoe UI" w:cs="Segoe UI"/>
+                <w:sz w:val="24"/>
+                <w:szCs w:val="24"/>
+              </w:rPr>
+              <w:t>Explanatory</w:t>
+            </w:r>
+          </w:p>
+        </w:tc>
+        <w:tc>
+          <w:tcPr>
+            <w:tcW w:w="2718" w:type="dxa"/>
+          </w:tcPr>
+          <w:p>
+            <w:pPr>
+              <w:spacing w:line="276" w:lineRule="auto"/>
+              <w:rPr>
+                <w:rFonts w:ascii="Segoe UI" w:hAnsi="Segoe UI" w:cs="Segoe UI"/>
+                <w:sz w:val="24"/>
+                <w:szCs w:val="24"/>
+              </w:rPr>
+            </w:pPr>
+            <w:r>
+              <w:rPr>
+                <w:rFonts w:ascii="Segoe UI" w:hAnsi="Segoe UI" w:cs="Segoe UI"/>
+                <w:sz w:val="24"/>
+                <w:szCs w:val="24"/>
+              </w:rPr>
+              <w:t>Speedrun.com</w:t>
+            </w:r>
+          </w:p>
+        </w:tc>
+      </w:tr>
+      <w:tr>
+        <w:trPr>
+          <w:trHeight w:val="443"/>
+        </w:trPr>
+        <w:tc>
+          <w:tcPr>
+            <w:tcW w:w="2842" w:type="dxa"/>
+          </w:tcPr>
+          <w:p>
+            <w:pPr>
+              <w:spacing w:line="276" w:lineRule="auto"/>
+              <w:rPr>
+                <w:rFonts w:ascii="Segoe UI" w:hAnsi="Segoe UI" w:cs="Segoe UI"/>
+                <w:sz w:val="24"/>
+                <w:szCs w:val="24"/>
+              </w:rPr>
+            </w:pPr>
+            <w:r>
+              <w:rPr>
+                <w:rFonts w:ascii="Segoe UI" w:hAnsi="Segoe UI" w:cs="Segoe UI"/>
+                <w:sz w:val="24"/>
+                <w:szCs w:val="24"/>
+              </w:rPr>
+              <w:t>World_record_margin</w:t>
+            </w:r>
+          </w:p>
+        </w:tc>
+        <w:tc>
+          <w:tcPr>
+            <w:tcW w:w="1686" w:type="dxa"/>
+          </w:tcPr>
+          <w:p>
+            <w:pPr>
+              <w:spacing w:line="276" w:lineRule="auto"/>
+              <w:rPr>
+                <w:rFonts w:ascii="Segoe UI" w:hAnsi="Segoe UI" w:cs="Segoe UI"/>
+                <w:sz w:val="24"/>
+                <w:szCs w:val="24"/>
+              </w:rPr>
+            </w:pPr>
+            <w:r>
+              <w:rPr>
+                <w:rFonts w:ascii="Segoe UI" w:hAnsi="Segoe UI" w:cs="Segoe UI"/>
+                <w:sz w:val="24"/>
+                <w:szCs w:val="24"/>
+              </w:rPr>
+              <w:t>Numerical</w:t>
+            </w:r>
+          </w:p>
+        </w:tc>
+        <w:tc>
+          <w:tcPr>
+            <w:tcW w:w="2105" w:type="dxa"/>
+          </w:tcPr>
+          <w:p>
+            <w:pPr>
+              <w:spacing w:line="276" w:lineRule="auto"/>
+              <w:rPr>
+                <w:rFonts w:ascii="Segoe UI" w:hAnsi="Segoe UI" w:cs="Segoe UI"/>
+                <w:sz w:val="24"/>
+                <w:szCs w:val="24"/>
+              </w:rPr>
+            </w:pPr>
+            <w:r>
+              <w:rPr>
+                <w:rFonts w:ascii="Segoe UI" w:hAnsi="Segoe UI" w:cs="Segoe UI"/>
+                <w:sz w:val="24"/>
+                <w:szCs w:val="24"/>
+              </w:rPr>
+              <w:t>Explanatory</w:t>
+            </w:r>
+          </w:p>
+        </w:tc>
+        <w:tc>
+          <w:tcPr>
+            <w:tcW w:w="2718" w:type="dxa"/>
+          </w:tcPr>
+          <w:p>
+            <w:pPr>
+              <w:spacing w:line="276" w:lineRule="auto"/>
+              <w:rPr>
+                <w:rFonts w:ascii="Segoe UI" w:hAnsi="Segoe UI" w:cs="Segoe UI"/>
+                <w:sz w:val="24"/>
+                <w:szCs w:val="24"/>
+              </w:rPr>
+            </w:pPr>
+            <w:r>
+              <w:rPr>
+                <w:rFonts w:ascii="Segoe UI" w:hAnsi="Segoe UI" w:cs="Segoe UI"/>
+                <w:sz w:val="24"/>
+                <w:szCs w:val="24"/>
+              </w:rPr>
+              <w:t>Speedrun.com</w:t>
+            </w:r>
+          </w:p>
+        </w:tc>
+      </w:tr>
+      <w:tr>
+        <w:trPr>
+          <w:trHeight w:val="443"/>
+        </w:trPr>
+        <w:tc>
+          <w:tcPr>
+            <w:tcW w:w="2842" w:type="dxa"/>
+          </w:tcPr>
+          <w:p>
+            <w:pPr>
+              <w:spacing w:line="276" w:lineRule="auto"/>
+              <w:rPr>
+                <w:rFonts w:ascii="Segoe UI" w:hAnsi="Segoe UI" w:cs="Segoe UI"/>
+                <w:sz w:val="24"/>
+                <w:szCs w:val="24"/>
+              </w:rPr>
+            </w:pPr>
+            <w:r>
+              <w:rPr>
+                <w:rFonts w:ascii="Segoe UI" w:hAnsi="Segoe UI" w:cs="Segoe UI"/>
+                <w:sz w:val="24"/>
+                <w:szCs w:val="24"/>
+              </w:rPr>
+              <w:t>Casual_Completion</w:t>
+            </w:r>
+          </w:p>
+        </w:tc>
+        <w:tc>
+          <w:tcPr>
+            <w:tcW w:w="1686" w:type="dxa"/>
+          </w:tcPr>
+          <w:p>
+            <w:pPr>
+              <w:spacing w:line="276" w:lineRule="auto"/>
+              <w:rPr>
+                <w:rFonts w:ascii="Segoe UI" w:hAnsi="Segoe UI" w:cs="Segoe UI"/>
+                <w:sz w:val="24"/>
+                <w:szCs w:val="24"/>
+              </w:rPr>
+            </w:pPr>
+            <w:r>
+              <w:rPr>
+                <w:rFonts w:ascii="Segoe UI" w:hAnsi="Segoe UI" w:cs="Segoe UI"/>
+                <w:sz w:val="24"/>
+                <w:szCs w:val="24"/>
+              </w:rPr>
+              <w:t>Numerical</w:t>
+            </w:r>
+          </w:p>
+        </w:tc>
+        <w:tc>
+          <w:tcPr>
+            <w:tcW w:w="2105" w:type="dxa"/>
+          </w:tcPr>
+          <w:p>
+            <w:pPr>
+              <w:spacing w:line="276" w:lineRule="auto"/>
+              <w:rPr>
+                <w:rFonts w:ascii="Segoe UI" w:hAnsi="Segoe UI" w:cs="Segoe UI"/>
+                <w:sz w:val="24"/>
+                <w:szCs w:val="24"/>
+              </w:rPr>
+            </w:pPr>
+            <w:r>
+              <w:rPr>
+                <w:rFonts w:ascii="Segoe UI" w:hAnsi="Segoe UI" w:cs="Segoe UI"/>
+                <w:sz w:val="24"/>
+                <w:szCs w:val="24"/>
+              </w:rPr>
+              <w:t>Explanatory</w:t>
+            </w:r>
+          </w:p>
+        </w:tc>
+        <w:tc>
+          <w:tcPr>
+            <w:tcW w:w="2718" w:type="dxa"/>
+          </w:tcPr>
+          <w:p>
+            <w:pPr>
+              <w:spacing w:line="276" w:lineRule="auto"/>
+              <w:rPr>
+                <w:rFonts w:ascii="Segoe UI" w:hAnsi="Segoe UI" w:cs="Segoe UI"/>
+                <w:sz w:val="24"/>
+                <w:szCs w:val="24"/>
+              </w:rPr>
+            </w:pPr>
+            <w:r>
+              <w:rPr>
+                <w:rFonts w:ascii="Segoe UI" w:hAnsi="Segoe UI" w:cs="Segoe UI"/>
+                <w:sz w:val="24"/>
+                <w:szCs w:val="24"/>
+              </w:rPr>
+              <w:t>Howlongtobeat.com</w:t>
+            </w:r>
+          </w:p>
+        </w:tc>
+      </w:tr>
+      <w:tr>
+        <w:trPr>
+          <w:trHeight w:val="443"/>
+        </w:trPr>
+        <w:tc>
+          <w:tcPr>
+            <w:tcW w:w="2842" w:type="dxa"/>
+          </w:tcPr>
+          <w:p>
+            <w:pPr>
+              <w:spacing w:line="276" w:lineRule="auto"/>
+              <w:rPr>
+                <w:rFonts w:ascii="Segoe UI" w:hAnsi="Segoe UI" w:cs="Segoe UI"/>
+                <w:sz w:val="24"/>
+                <w:szCs w:val="24"/>
+              </w:rPr>
+            </w:pPr>
+            <w:r>
+              <w:rPr>
+                <w:rFonts w:ascii="Segoe UI" w:hAnsi="Segoe UI" w:cs="Segoe UI"/>
+                <w:sz w:val="24"/>
+                <w:szCs w:val="24"/>
+              </w:rPr>
+              <w:t>Glitches_possible</w:t>
+            </w:r>
+          </w:p>
+        </w:tc>
+        <w:tc>
+          <w:tcPr>
+            <w:tcW w:w="1686" w:type="dxa"/>
+          </w:tcPr>
+          <w:p>
+            <w:pPr>
+              <w:spacing w:line="276" w:lineRule="auto"/>
+              <w:rPr>
+                <w:rFonts w:ascii="Segoe UI" w:hAnsi="Segoe UI" w:cs="Segoe UI"/>
+                <w:sz w:val="24"/>
+                <w:szCs w:val="24"/>
+              </w:rPr>
+            </w:pPr>
+            <w:r>
+              <w:rPr>
+                <w:rFonts w:ascii="Segoe UI" w:hAnsi="Segoe UI" w:cs="Segoe UI"/>
+                <w:sz w:val="24"/>
+                <w:szCs w:val="24"/>
+              </w:rPr>
+              <w:t>Categorical</w:t>
+            </w:r>
+          </w:p>
+        </w:tc>
+        <w:tc>
+          <w:tcPr>
+            <w:tcW w:w="2105" w:type="dxa"/>
+          </w:tcPr>
+          <w:p>
+            <w:pPr>
+              <w:spacing w:line="276" w:lineRule="auto"/>
+              <w:rPr>
+                <w:rFonts w:ascii="Segoe UI" w:hAnsi="Segoe UI" w:cs="Segoe UI"/>
+                <w:sz w:val="24"/>
+                <w:szCs w:val="24"/>
+              </w:rPr>
+            </w:pPr>
+            <w:r>
+              <w:rPr>
+                <w:rFonts w:ascii="Segoe UI" w:hAnsi="Segoe UI" w:cs="Segoe UI"/>
+                <w:sz w:val="24"/>
+                <w:szCs w:val="24"/>
+              </w:rPr>
+              <w:t>Not relevant</w:t>
+            </w:r>
+          </w:p>
+        </w:tc>
+        <w:tc>
+          <w:tcPr>
+            <w:tcW w:w="2718" w:type="dxa"/>
+          </w:tcPr>
+          <w:p>
+            <w:pPr>
+              <w:spacing w:line="276" w:lineRule="auto"/>
+              <w:rPr>
+                <w:rFonts w:ascii="Segoe UI" w:hAnsi="Segoe UI" w:cs="Segoe UI"/>
+                <w:sz w:val="24"/>
+                <w:szCs w:val="24"/>
+              </w:rPr>
+            </w:pPr>
+            <w:r>
+              <w:rPr>
+                <w:rFonts w:ascii="Segoe UI" w:hAnsi="Segoe UI" w:cs="Segoe UI"/>
+                <w:sz w:val="24"/>
+                <w:szCs w:val="24"/>
+              </w:rPr>
+              <w:t>Youtube.com</w:t>
+            </w:r>
+          </w:p>
+        </w:tc>
+      </w:tr>
+      <w:tr>
+        <w:trPr>
+          <w:trHeight w:val="443"/>
+        </w:trPr>
+        <w:tc>
+          <w:tcPr>
+            <w:tcW w:w="2842" w:type="dxa"/>
+          </w:tcPr>
+          <w:p>
+            <w:pPr>
+              <w:spacing w:line="276" w:lineRule="auto"/>
+              <w:rPr>
+                <w:rFonts w:ascii="Segoe UI" w:hAnsi="Segoe UI" w:cs="Segoe UI"/>
+                <w:sz w:val="24"/>
+                <w:szCs w:val="24"/>
+              </w:rPr>
+            </w:pPr>
+            <w:r>
+              <w:rPr>
+                <w:rFonts w:ascii="Segoe UI" w:hAnsi="Segoe UI" w:cs="Segoe UI"/>
+                <w:sz w:val="24"/>
+                <w:szCs w:val="24"/>
+              </w:rPr>
+              <w:t>Platform</w:t>
+            </w:r>
+          </w:p>
+        </w:tc>
+        <w:tc>
+          <w:tcPr>
+            <w:tcW w:w="1686" w:type="dxa"/>
+          </w:tcPr>
+          <w:p>
+            <w:pPr>
+              <w:spacing w:line="276" w:lineRule="auto"/>
+              <w:rPr>
+                <w:rFonts w:ascii="Segoe UI" w:hAnsi="Segoe UI" w:cs="Segoe UI"/>
+                <w:sz w:val="24"/>
+                <w:szCs w:val="24"/>
+              </w:rPr>
+            </w:pPr>
+            <w:r>
+              <w:rPr>
+                <w:rFonts w:ascii="Segoe UI" w:hAnsi="Segoe UI" w:cs="Segoe UI"/>
+                <w:sz w:val="24"/>
+                <w:szCs w:val="24"/>
+              </w:rPr>
+              <w:t>Categorical</w:t>
+            </w:r>
+          </w:p>
+        </w:tc>
+        <w:tc>
+          <w:tcPr>
+            <w:tcW w:w="2105" w:type="dxa"/>
+          </w:tcPr>
+          <w:p>
+            <w:pPr>
+              <w:spacing w:line="276" w:lineRule="auto"/>
+              <w:rPr>
+                <w:rFonts w:ascii="Segoe UI" w:hAnsi="Segoe UI" w:cs="Segoe UI"/>
+                <w:sz w:val="24"/>
+                <w:szCs w:val="24"/>
+              </w:rPr>
+            </w:pPr>
+            <w:r>
+              <w:rPr>
+                <w:rFonts w:ascii="Segoe UI" w:hAnsi="Segoe UI" w:cs="Segoe UI"/>
+                <w:sz w:val="24"/>
+                <w:szCs w:val="24"/>
+              </w:rPr>
+              <w:t>Not relevant</w:t>
+            </w:r>
+          </w:p>
+        </w:tc>
+        <w:tc>
+          <w:tcPr>
+            <w:tcW w:w="2718" w:type="dxa"/>
+          </w:tcPr>
+          <w:p>
+            <w:pPr>
+              <w:spacing w:line="276" w:lineRule="auto"/>
+              <w:rPr>
+                <w:rFonts w:ascii="Segoe UI" w:hAnsi="Segoe UI" w:cs="Segoe UI"/>
+                <w:sz w:val="24"/>
+                <w:szCs w:val="24"/>
+              </w:rPr>
+            </w:pPr>
+            <w:r>
+              <w:rPr>
+                <w:rFonts w:ascii="Segoe UI" w:hAnsi="Segoe UI" w:cs="Segoe UI"/>
+                <w:sz w:val="24"/>
+                <w:szCs w:val="24"/>
+              </w:rPr>
+              <w:t>Speedrun.com</w:t>
+            </w:r>
+          </w:p>
+        </w:tc>
+      </w:tr>
+      <w:tr>
+        <w:trPr>
+          <w:trHeight w:val="443"/>
+        </w:trPr>
+        <w:tc>
+          <w:tcPr>
+            <w:tcW w:w="2842" w:type="dxa"/>
+          </w:tcPr>
+          <w:p>
+            <w:pPr>
+              <w:spacing w:line="276" w:lineRule="auto"/>
+              <w:rPr>
+                <w:rFonts w:ascii="Segoe UI" w:hAnsi="Segoe UI" w:cs="Segoe UI"/>
+                <w:sz w:val="24"/>
+                <w:szCs w:val="24"/>
+              </w:rPr>
+            </w:pPr>
+            <w:r>
+              <w:rPr>
+                <w:rFonts w:ascii="Segoe UI" w:hAnsi="Segoe UI" w:cs="Segoe UI"/>
+                <w:sz w:val="24"/>
+                <w:szCs w:val="24"/>
+              </w:rPr>
+              <w:t>Category</w:t>
+            </w:r>
+          </w:p>
+        </w:tc>
+        <w:tc>
+          <w:tcPr>
+            <w:tcW w:w="1686" w:type="dxa"/>
+          </w:tcPr>
+          <w:p>
+            <w:pPr>
+              <w:spacing w:line="276" w:lineRule="auto"/>
+              <w:rPr>
+                <w:rFonts w:ascii="Segoe UI" w:hAnsi="Segoe UI" w:cs="Segoe UI"/>
+                <w:sz w:val="24"/>
+                <w:szCs w:val="24"/>
+              </w:rPr>
+            </w:pPr>
+            <w:r>
+              <w:rPr>
+                <w:rFonts w:ascii="Segoe UI" w:hAnsi="Segoe UI" w:cs="Segoe UI"/>
+                <w:sz w:val="24"/>
+                <w:szCs w:val="24"/>
+              </w:rPr>
+              <w:t>Categorical</w:t>
+            </w:r>
+          </w:p>
+        </w:tc>
+        <w:tc>
+          <w:tcPr>
+            <w:tcW w:w="2105" w:type="dxa"/>
+          </w:tcPr>
+          <w:p>
+            <w:pPr>
+              <w:spacing w:line="276" w:lineRule="auto"/>
+              <w:rPr>
+                <w:rFonts w:ascii="Segoe UI" w:hAnsi="Segoe UI" w:cs="Segoe UI"/>
+                <w:sz w:val="24"/>
+                <w:szCs w:val="24"/>
+              </w:rPr>
+            </w:pPr>
+            <w:r>
+              <w:rPr>
+                <w:rFonts w:ascii="Segoe UI" w:hAnsi="Segoe UI" w:cs="Segoe UI"/>
+                <w:sz w:val="24"/>
+                <w:szCs w:val="24"/>
+              </w:rPr>
+              <w:t>Not relevant</w:t>
+            </w:r>
+          </w:p>
+        </w:tc>
+        <w:tc>
+          <w:tcPr>
+            <w:tcW w:w="2718" w:type="dxa"/>
+          </w:tcPr>
+          <w:p>
+            <w:pPr>
+              <w:spacing w:line="276" w:lineRule="auto"/>
+              <w:rPr>
+                <w:rFonts w:ascii="Segoe UI" w:hAnsi="Segoe UI" w:cs="Segoe UI"/>
+                <w:sz w:val="24"/>
+                <w:szCs w:val="24"/>
+              </w:rPr>
+            </w:pPr>
+            <w:r>
+              <w:rPr>
+                <w:rFonts w:ascii="Segoe UI" w:hAnsi="Segoe UI" w:cs="Segoe UI"/>
+                <w:sz w:val="24"/>
+                <w:szCs w:val="24"/>
+              </w:rPr>
+              <w:t>Speedrun.com</w:t>
+            </w:r>
+          </w:p>
+        </w:tc>
+      </w:tr>
+      <w:tr>
+        <w:trPr>
+          <w:trHeight w:val="462"/>
+        </w:trPr>
+        <w:tc>
+          <w:tcPr>
+            <w:tcW w:w="2842" w:type="dxa"/>
+          </w:tcPr>
+          <w:p>
+            <w:pPr>
+              <w:spacing w:line="276" w:lineRule="auto"/>
+              <w:rPr>
+                <w:rFonts w:ascii="Segoe UI" w:hAnsi="Segoe UI" w:cs="Segoe UI"/>
+                <w:sz w:val="24"/>
+                <w:szCs w:val="24"/>
+              </w:rPr>
+            </w:pPr>
+            <w:r>
+              <w:rPr>
+                <w:rFonts w:ascii="Segoe UI" w:hAnsi="Segoe UI" w:cs="Segoe UI"/>
+                <w:sz w:val="24"/>
+                <w:szCs w:val="24"/>
+              </w:rPr>
+              <w:t>Active Runners</w:t>
+            </w:r>
+          </w:p>
+        </w:tc>
+        <w:tc>
+          <w:tcPr>
+            <w:tcW w:w="1686" w:type="dxa"/>
+          </w:tcPr>
+          <w:p>
+            <w:pPr>
+              <w:spacing w:line="276" w:lineRule="auto"/>
+              <w:rPr>
+                <w:rFonts w:ascii="Segoe UI" w:hAnsi="Segoe UI" w:cs="Segoe UI"/>
+                <w:sz w:val="24"/>
+                <w:szCs w:val="24"/>
+              </w:rPr>
+            </w:pPr>
+            <w:r>
+              <w:rPr>
+                <w:rFonts w:ascii="Segoe UI" w:hAnsi="Segoe UI" w:cs="Segoe UI"/>
+                <w:sz w:val="24"/>
+                <w:szCs w:val="24"/>
+              </w:rPr>
+              <w:t>Numerical</w:t>
+            </w:r>
+          </w:p>
+        </w:tc>
+        <w:tc>
+          <w:tcPr>
+            <w:tcW w:w="2105" w:type="dxa"/>
+          </w:tcPr>
+          <w:p>
+            <w:pPr>
+              <w:spacing w:line="276" w:lineRule="auto"/>
+              <w:rPr>
+                <w:rFonts w:ascii="Segoe UI" w:hAnsi="Segoe UI" w:cs="Segoe UI"/>
+                <w:sz w:val="24"/>
+                <w:szCs w:val="24"/>
+              </w:rPr>
+            </w:pPr>
+            <w:r>
+              <w:rPr>
+                <w:rFonts w:ascii="Segoe UI" w:hAnsi="Segoe UI" w:cs="Segoe UI"/>
+                <w:sz w:val="24"/>
+                <w:szCs w:val="24"/>
+              </w:rPr>
+              <w:t>Explanatory</w:t>
+            </w:r>
+          </w:p>
+        </w:tc>
+        <w:tc>
+          <w:tcPr>
+            <w:tcW w:w="2718" w:type="dxa"/>
+          </w:tcPr>
+          <w:p>
+            <w:pPr>
+              <w:spacing w:line="276" w:lineRule="auto"/>
+              <w:rPr>
+                <w:rFonts w:ascii="Segoe UI" w:hAnsi="Segoe UI" w:cs="Segoe UI"/>
+                <w:sz w:val="24"/>
+                <w:szCs w:val="24"/>
+              </w:rPr>
+            </w:pPr>
+            <w:r>
+              <w:rPr>
+                <w:rFonts w:ascii="Segoe UI" w:hAnsi="Segoe UI" w:cs="Segoe UI"/>
+                <w:sz w:val="24"/>
+                <w:szCs w:val="24"/>
+              </w:rPr>
+              <w:t>Speedrun.com</w:t>
+            </w:r>
+          </w:p>
+        </w:tc>
+      </w:tr>
+      <w:tr>
+        <w:trPr>
+          <w:trHeight w:val="425"/>
+        </w:trPr>
+        <w:tc>
+          <w:tcPr>
+            <w:tcW w:w="2842" w:type="dxa"/>
+          </w:tcPr>
+          <w:p>
+            <w:pPr>
+              <w:spacing w:line="276" w:lineRule="auto"/>
+              <w:rPr>
+                <w:rFonts w:ascii="Segoe UI" w:hAnsi="Segoe UI" w:cs="Segoe UI"/>
+                <w:sz w:val="24"/>
+                <w:szCs w:val="24"/>
+              </w:rPr>
+            </w:pPr>
+            <w:r>
+              <w:rPr>
+                <w:rFonts w:ascii="Segoe UI" w:hAnsi="Segoe UI" w:cs="Segoe UI"/>
+                <w:sz w:val="24"/>
+                <w:szCs w:val="24"/>
+              </w:rPr>
+              <w:t>RNG</w:t>
+            </w:r>
+          </w:p>
+        </w:tc>
+        <w:tc>
+          <w:tcPr>
+            <w:tcW w:w="1686" w:type="dxa"/>
+          </w:tcPr>
+          <w:p>
+            <w:pPr>
+              <w:spacing w:line="276" w:lineRule="auto"/>
+              <w:rPr>
+                <w:rFonts w:ascii="Segoe UI" w:hAnsi="Segoe UI" w:cs="Segoe UI"/>
+                <w:sz w:val="24"/>
+                <w:szCs w:val="24"/>
+              </w:rPr>
+            </w:pPr>
+            <w:r>
+              <w:rPr>
+                <w:rFonts w:ascii="Segoe UI" w:hAnsi="Segoe UI" w:cs="Segoe UI"/>
+                <w:sz w:val="24"/>
+                <w:szCs w:val="24"/>
+              </w:rPr>
+              <w:t>Categorical</w:t>
+            </w:r>
+          </w:p>
+        </w:tc>
+        <w:tc>
+          <w:tcPr>
+            <w:tcW w:w="2105" w:type="dxa"/>
+          </w:tcPr>
+          <w:p>
+            <w:pPr>
+              <w:spacing w:line="276" w:lineRule="auto"/>
+              <w:rPr>
+                <w:rFonts w:ascii="Segoe UI" w:hAnsi="Segoe UI" w:cs="Segoe UI"/>
+                <w:sz w:val="24"/>
+                <w:szCs w:val="24"/>
+              </w:rPr>
+            </w:pPr>
+            <w:r>
+              <w:rPr>
+                <w:rFonts w:ascii="Segoe UI" w:hAnsi="Segoe UI" w:cs="Segoe UI"/>
+                <w:sz w:val="24"/>
+                <w:szCs w:val="24"/>
+              </w:rPr>
+              <w:t>Not relevant</w:t>
+            </w:r>
+          </w:p>
+        </w:tc>
+        <w:tc>
+          <w:tcPr>
+            <w:tcW w:w="2718" w:type="dxa"/>
+          </w:tcPr>
+          <w:p>
+            <w:pPr>
+              <w:spacing w:line="276" w:lineRule="auto"/>
+              <w:rPr>
+                <w:rFonts w:ascii="Segoe UI" w:hAnsi="Segoe UI" w:cs="Segoe UI"/>
+                <w:sz w:val="24"/>
+                <w:szCs w:val="24"/>
+              </w:rPr>
+            </w:pPr>
+            <w:r>
+              <w:rPr>
+                <w:rFonts w:ascii="Segoe UI" w:hAnsi="Segoe UI" w:cs="Segoe UI"/>
+                <w:sz w:val="24"/>
+                <w:szCs w:val="24"/>
+              </w:rPr>
+              <w:t>Youtube.com</w:t>
+            </w:r>
+          </w:p>
+        </w:tc>
+      </w:tr>
+    </w:tbl>
     <w:p>
       <w:pPr>
         <w:pStyle w:val="Heading1"/>
@@ -1489,6 +3246,7 @@
           <w:sz w:val="28"/>
           <w:szCs w:val="28"/>
         </w:rPr>
+        <w:lastRenderedPageBreak/>
         <w:t>Imputation of missing data</w:t>
       </w:r>
     </w:p>
@@ -1497,224 +3255,946 @@
         <w:spacing w:line="360" w:lineRule="auto"/>
         <w:rPr>
           <w:rFonts w:ascii="Segoe UI" w:hAnsi="Segoe UI" w:cs="Segoe UI"/>
-        </w:rPr>
-      </w:pPr>
-    </w:p>
-    <w:p>
-      <w:pPr>
-        <w:spacing w:line="360" w:lineRule="auto"/>
-        <w:rPr>
-          <w:rFonts w:ascii="Segoe UI" w:hAnsi="Segoe UI" w:cs="Segoe UI"/>
-        </w:rPr>
-      </w:pPr>
-    </w:p>
-    <w:p>
-      <w:pPr>
-        <w:spacing w:line="360" w:lineRule="auto"/>
-        <w:rPr>
-          <w:rFonts w:ascii="Segoe UI" w:hAnsi="Segoe UI" w:cs="Segoe UI"/>
-        </w:rPr>
-      </w:pPr>
-    </w:p>
-    <w:p>
-      <w:pPr>
-        <w:spacing w:line="360" w:lineRule="auto"/>
-        <w:rPr>
-          <w:rFonts w:ascii="Segoe UI" w:hAnsi="Segoe UI" w:cs="Segoe UI"/>
-        </w:rPr>
-      </w:pPr>
-    </w:p>
-    <w:p>
-      <w:pPr>
-        <w:spacing w:line="360" w:lineRule="auto"/>
-        <w:rPr>
-          <w:rFonts w:ascii="Segoe UI" w:hAnsi="Segoe UI" w:cs="Segoe UI"/>
-        </w:rPr>
-      </w:pPr>
-    </w:p>
-    <w:p>
-      <w:pPr>
-        <w:spacing w:line="360" w:lineRule="auto"/>
-        <w:rPr>
-          <w:rFonts w:ascii="Segoe UI" w:hAnsi="Segoe UI" w:cs="Segoe UI"/>
-        </w:rPr>
-      </w:pPr>
-    </w:p>
-    <w:p>
-      <w:pPr>
-        <w:spacing w:line="360" w:lineRule="auto"/>
-        <w:rPr>
-          <w:rFonts w:ascii="Segoe UI" w:hAnsi="Segoe UI" w:cs="Segoe UI"/>
-        </w:rPr>
-      </w:pPr>
-    </w:p>
-    <w:p>
-      <w:pPr>
-        <w:spacing w:line="360" w:lineRule="auto"/>
-        <w:rPr>
-          <w:rFonts w:ascii="Segoe UI" w:hAnsi="Segoe UI" w:cs="Segoe UI"/>
-        </w:rPr>
-      </w:pPr>
-    </w:p>
-    <w:p>
-      <w:pPr>
-        <w:spacing w:line="360" w:lineRule="auto"/>
-        <w:rPr>
-          <w:rFonts w:ascii="Segoe UI" w:hAnsi="Segoe UI" w:cs="Segoe UI"/>
-        </w:rPr>
-      </w:pPr>
-    </w:p>
-    <w:p>
-      <w:pPr>
-        <w:spacing w:line="360" w:lineRule="auto"/>
-        <w:rPr>
-          <w:rFonts w:ascii="Segoe UI" w:hAnsi="Segoe UI" w:cs="Segoe UI"/>
-        </w:rPr>
-      </w:pPr>
-    </w:p>
-    <w:p>
-      <w:pPr>
-        <w:spacing w:line="360" w:lineRule="auto"/>
-        <w:rPr>
-          <w:rFonts w:ascii="Segoe UI" w:hAnsi="Segoe UI" w:cs="Segoe UI"/>
-        </w:rPr>
-      </w:pPr>
-    </w:p>
-    <w:p>
-      <w:pPr>
-        <w:spacing w:line="360" w:lineRule="auto"/>
-        <w:rPr>
-          <w:rFonts w:ascii="Segoe UI" w:hAnsi="Segoe UI" w:cs="Segoe UI"/>
-        </w:rPr>
-      </w:pPr>
-    </w:p>
-    <w:p>
-      <w:pPr>
-        <w:spacing w:line="360" w:lineRule="auto"/>
-        <w:rPr>
-          <w:rFonts w:ascii="Segoe UI" w:hAnsi="Segoe UI" w:cs="Segoe UI"/>
-        </w:rPr>
-      </w:pPr>
-    </w:p>
-    <w:p>
-      <w:pPr>
-        <w:spacing w:line="360" w:lineRule="auto"/>
-        <w:rPr>
-          <w:rFonts w:ascii="Segoe UI" w:hAnsi="Segoe UI" w:cs="Segoe UI"/>
-        </w:rPr>
-      </w:pPr>
-    </w:p>
-    <w:p>
-      <w:pPr>
-        <w:spacing w:line="360" w:lineRule="auto"/>
-        <w:rPr>
-          <w:rFonts w:ascii="Segoe UI" w:hAnsi="Segoe UI" w:cs="Segoe UI"/>
-        </w:rPr>
-      </w:pPr>
-    </w:p>
-    <w:p>
-      <w:pPr>
-        <w:spacing w:line="360" w:lineRule="auto"/>
-        <w:rPr>
-          <w:rFonts w:ascii="Segoe UI" w:hAnsi="Segoe UI" w:cs="Segoe UI"/>
-        </w:rPr>
-      </w:pPr>
-    </w:p>
-    <w:p>
-      <w:pPr>
-        <w:spacing w:line="360" w:lineRule="auto"/>
-        <w:rPr>
-          <w:rFonts w:ascii="Segoe UI" w:hAnsi="Segoe UI" w:cs="Segoe UI"/>
-        </w:rPr>
-      </w:pPr>
-    </w:p>
-    <w:p>
-      <w:pPr>
-        <w:spacing w:line="360" w:lineRule="auto"/>
-        <w:rPr>
-          <w:rFonts w:ascii="Segoe UI" w:hAnsi="Segoe UI" w:cs="Segoe UI"/>
-        </w:rPr>
-      </w:pPr>
-    </w:p>
-    <w:p>
-      <w:pPr>
-        <w:spacing w:line="360" w:lineRule="auto"/>
-        <w:rPr>
-          <w:rFonts w:ascii="Segoe UI" w:hAnsi="Segoe UI" w:cs="Segoe UI"/>
-        </w:rPr>
-      </w:pPr>
-    </w:p>
-    <w:p>
-      <w:pPr>
-        <w:spacing w:line="360" w:lineRule="auto"/>
-        <w:rPr>
-          <w:rFonts w:ascii="Segoe UI" w:hAnsi="Segoe UI" w:cs="Segoe UI"/>
-        </w:rPr>
-      </w:pPr>
-    </w:p>
-    <w:p>
-      <w:pPr>
-        <w:spacing w:line="360" w:lineRule="auto"/>
-        <w:rPr>
-          <w:rFonts w:ascii="Segoe UI" w:hAnsi="Segoe UI" w:cs="Segoe UI"/>
-        </w:rPr>
-      </w:pPr>
-    </w:p>
-    <w:p>
-      <w:pPr>
-        <w:spacing w:line="360" w:lineRule="auto"/>
-        <w:rPr>
-          <w:rFonts w:ascii="Segoe UI" w:hAnsi="Segoe UI" w:cs="Segoe UI"/>
-        </w:rPr>
-      </w:pPr>
-    </w:p>
-    <w:p>
-      <w:pPr>
-        <w:spacing w:line="360" w:lineRule="auto"/>
-        <w:rPr>
-          <w:rFonts w:ascii="Segoe UI" w:hAnsi="Segoe UI" w:cs="Segoe UI"/>
-        </w:rPr>
-      </w:pPr>
-    </w:p>
-    <w:p>
-      <w:pPr>
-        <w:spacing w:line="360" w:lineRule="auto"/>
-        <w:rPr>
-          <w:rFonts w:ascii="Segoe UI" w:hAnsi="Segoe UI" w:cs="Segoe UI"/>
-        </w:rPr>
-      </w:pPr>
-    </w:p>
-    <w:p>
-      <w:pPr>
-        <w:spacing w:line="360" w:lineRule="auto"/>
-        <w:rPr>
-          <w:rFonts w:ascii="Segoe UI" w:hAnsi="Segoe UI" w:cs="Segoe UI"/>
-        </w:rPr>
-      </w:pPr>
-    </w:p>
-    <w:p>
-      <w:pPr>
-        <w:spacing w:line="360" w:lineRule="auto"/>
-        <w:rPr>
-          <w:rFonts w:ascii="Segoe UI" w:hAnsi="Segoe UI" w:cs="Segoe UI"/>
-        </w:rPr>
-      </w:pPr>
-    </w:p>
-    <w:p>
-      <w:pPr>
-        <w:spacing w:line="360" w:lineRule="auto"/>
-        <w:rPr>
-          <w:rFonts w:ascii="Segoe UI" w:hAnsi="Segoe UI" w:cs="Segoe UI"/>
-        </w:rPr>
-      </w:pPr>
-    </w:p>
-    <w:p>
-      <w:pPr>
-        <w:spacing w:line="360" w:lineRule="auto"/>
-        <w:rPr>
-          <w:rFonts w:ascii="Segoe UI" w:hAnsi="Segoe UI" w:cs="Segoe UI"/>
-        </w:rPr>
-      </w:pPr>
+          <w:sz w:val="24"/>
+          <w:szCs w:val="24"/>
+        </w:rPr>
+      </w:pPr>
+      <w:r>
+        <w:rPr>
+          <w:rFonts w:ascii="Segoe UI" w:hAnsi="Segoe UI" w:cs="Segoe UI"/>
+          <w:sz w:val="24"/>
+          <w:szCs w:val="24"/>
+        </w:rPr>
+        <w:t xml:space="preserve">A complete dataset is needed for </w:t>
+      </w:r>
+      <w:r>
+        <w:rPr>
+          <w:rFonts w:ascii="Segoe UI" w:hAnsi="Segoe UI" w:cs="Segoe UI"/>
+          <w:sz w:val="24"/>
+          <w:szCs w:val="24"/>
+        </w:rPr>
+        <w:t>building an index. By using a heatmap I was able to identify any sections in the dataset that may have missing values.</w:t>
+      </w:r>
+    </w:p>
+    <w:p>
+      <w:pPr>
+        <w:keepNext/>
+        <w:spacing w:line="360" w:lineRule="auto"/>
+      </w:pPr>
+      <w:r>
+        <w:rPr>
+          <w:rFonts w:ascii="Segoe UI" w:hAnsi="Segoe UI" w:cs="Segoe UI"/>
+          <w:sz w:val="24"/>
+          <w:szCs w:val="24"/>
+        </w:rPr>
+        <w:drawing>
+          <wp:inline distT="0" distB="0" distL="0" distR="0" wp14:anchorId="5C44BDDF" wp14:editId="00F2E97D">
+            <wp:extent cx="4562475" cy="5634601"/>
+            <wp:effectExtent l="0" t="0" r="0" b="4445"/>
+            <wp:docPr id="854316300" name="Picture 1"/>
+            <wp:cNvGraphicFramePr>
+              <a:graphicFrameLocks xmlns:a="http://schemas.openxmlformats.org/drawingml/2006/main" noChangeAspect="1"/>
+            </wp:cNvGraphicFramePr>
+            <a:graphic xmlns:a="http://schemas.openxmlformats.org/drawingml/2006/main">
+              <a:graphicData uri="http://schemas.openxmlformats.org/drawingml/2006/picture">
+                <pic:pic xmlns:pic="http://schemas.openxmlformats.org/drawingml/2006/picture">
+                  <pic:nvPicPr>
+                    <pic:cNvPr id="854316300" name=""/>
+                    <pic:cNvPicPr/>
+                  </pic:nvPicPr>
+                  <pic:blipFill>
+                    <a:blip r:embed="rId8"/>
+                    <a:stretch>
+                      <a:fillRect/>
+                    </a:stretch>
+                  </pic:blipFill>
+                  <pic:spPr>
+                    <a:xfrm>
+                      <a:off x="0" y="0"/>
+                      <a:ext cx="4567525" cy="5640837"/>
+                    </a:xfrm>
+                    <a:prstGeom prst="rect">
+                      <a:avLst/>
+                    </a:prstGeom>
+                  </pic:spPr>
+                </pic:pic>
+              </a:graphicData>
+            </a:graphic>
+          </wp:inline>
+        </w:drawing>
+      </w:r>
+    </w:p>
+    <w:p>
+      <w:pPr>
+        <w:pStyle w:val="Caption"/>
+      </w:pPr>
+      <w:r>
+        <w:t xml:space="preserve">Figure </w:t>
+      </w:r>
+      <w:fldSimple w:instr=" SEQ Figure \* ARABIC ">
+        <w:r>
+          <w:rPr>
+            <w:noProof/>
+          </w:rPr>
+          <w:t>1</w:t>
+        </w:r>
+      </w:fldSimple>
+      <w:r>
+        <w:t xml:space="preserve"> Heatmap indicating missing values within dataset</w:t>
+      </w:r>
+    </w:p>
+    <w:p>
+      <w:pPr>
+        <w:spacing w:line="360" w:lineRule="auto"/>
+        <w:rPr>
+          <w:rFonts w:ascii="Segoe UI" w:hAnsi="Segoe UI" w:cs="Segoe UI"/>
+          <w:sz w:val="24"/>
+          <w:szCs w:val="24"/>
+        </w:rPr>
+      </w:pPr>
+      <w:r>
+        <w:rPr>
+          <w:rFonts w:ascii="Segoe UI" w:hAnsi="Segoe UI" w:cs="Segoe UI"/>
+          <w:sz w:val="24"/>
+          <w:szCs w:val="24"/>
+        </w:rPr>
+        <w:t xml:space="preserve"> After analysing this heatmap, it is evident that there are 5 missing values within the dataset, 4 within casual_completion and 1 within platform. To solve this problem</w:t>
+      </w:r>
+      <w:r>
+        <w:rPr>
+          <w:rFonts w:ascii="Segoe UI" w:hAnsi="Segoe UI" w:cs="Segoe UI"/>
+          <w:sz w:val="24"/>
+          <w:szCs w:val="24"/>
+        </w:rPr>
+        <w:t xml:space="preserve">, I utilised single imputation. </w:t>
+      </w:r>
+      <w:r>
+        <w:rPr>
+          <w:rFonts w:ascii="Segoe UI" w:hAnsi="Segoe UI" w:cs="Segoe UI"/>
+          <w:sz w:val="24"/>
+          <w:szCs w:val="24"/>
+        </w:rPr>
+        <w:t xml:space="preserve">Before applying single imputation however, to ensure that </w:t>
+      </w:r>
+      <w:proofErr w:type="gramStart"/>
+      <w:r>
+        <w:rPr>
+          <w:rFonts w:ascii="Segoe UI" w:hAnsi="Segoe UI" w:cs="Segoe UI"/>
+          <w:sz w:val="24"/>
+          <w:szCs w:val="24"/>
+        </w:rPr>
+        <w:t>all of</w:t>
+      </w:r>
+      <w:proofErr w:type="gramEnd"/>
+      <w:r>
+        <w:rPr>
+          <w:rFonts w:ascii="Segoe UI" w:hAnsi="Segoe UI" w:cs="Segoe UI"/>
+          <w:sz w:val="24"/>
+          <w:szCs w:val="24"/>
+        </w:rPr>
+        <w:t xml:space="preserve"> my timed variables are being treated equally, I converted </w:t>
+      </w:r>
+      <w:r>
+        <w:rPr>
+          <w:rFonts w:ascii="Segoe UI" w:hAnsi="Segoe UI" w:cs="Segoe UI"/>
+          <w:b/>
+          <w:bCs/>
+          <w:sz w:val="24"/>
+          <w:szCs w:val="24"/>
+        </w:rPr>
+        <w:t xml:space="preserve">world_record_time, </w:t>
+      </w:r>
+      <w:r>
+        <w:rPr>
+          <w:rFonts w:ascii="Segoe UI" w:hAnsi="Segoe UI" w:cs="Segoe UI"/>
+          <w:b/>
+          <w:bCs/>
+          <w:sz w:val="24"/>
+          <w:szCs w:val="24"/>
+        </w:rPr>
+        <w:lastRenderedPageBreak/>
+        <w:t xml:space="preserve">world_record_margin </w:t>
+      </w:r>
+      <w:r>
+        <w:rPr>
+          <w:rFonts w:ascii="Segoe UI" w:hAnsi="Segoe UI" w:cs="Segoe UI"/>
+          <w:sz w:val="24"/>
+          <w:szCs w:val="24"/>
+        </w:rPr>
+        <w:t xml:space="preserve">and </w:t>
+      </w:r>
+      <w:r>
+        <w:rPr>
+          <w:rFonts w:ascii="Segoe UI" w:hAnsi="Segoe UI" w:cs="Segoe UI"/>
+          <w:b/>
+          <w:bCs/>
+          <w:sz w:val="24"/>
+          <w:szCs w:val="24"/>
+        </w:rPr>
+        <w:t>casual_completion</w:t>
+      </w:r>
+      <w:r>
+        <w:rPr>
+          <w:rFonts w:ascii="Segoe UI" w:hAnsi="Segoe UI" w:cs="Segoe UI"/>
+          <w:sz w:val="24"/>
+          <w:szCs w:val="24"/>
+        </w:rPr>
+        <w:t xml:space="preserve"> into seconds instead of hours and minutes.</w:t>
+      </w:r>
+    </w:p>
+    <w:p>
+      <w:pPr>
+        <w:spacing w:line="360" w:lineRule="auto"/>
+        <w:rPr>
+          <w:rFonts w:ascii="Segoe UI" w:hAnsi="Segoe UI" w:cs="Segoe UI"/>
+          <w:sz w:val="24"/>
+          <w:szCs w:val="24"/>
+        </w:rPr>
+      </w:pPr>
+      <w:r>
+        <w:rPr>
+          <w:rFonts w:ascii="Segoe UI" w:hAnsi="Segoe UI" w:cs="Segoe UI"/>
+          <w:sz w:val="24"/>
+          <w:szCs w:val="24"/>
+        </w:rPr>
+        <w:t xml:space="preserve">For casual_completion I used the mean of the category to fill in the missing values within the category. This imputation will ensure that the missing values won’t create outliers within the composite indicator during multivariate analysis. For the platform category, I used the mode of the category to make an educated guess on the system that this game was apart of. This category is not being used to build the index therefore it will have no impact on the composite indicator. Now that we have a complete dataset, I </w:t>
+      </w:r>
+      <w:r>
+        <w:rPr>
+          <w:rFonts w:ascii="Segoe UI" w:hAnsi="Segoe UI" w:cs="Segoe UI"/>
+          <w:sz w:val="24"/>
+          <w:szCs w:val="24"/>
+        </w:rPr>
+        <w:t>checked for outliers within each category to look for any values that may impact the imputation of my data.</w:t>
+      </w:r>
+    </w:p>
+    <w:p>
+      <w:pPr>
+        <w:keepNext/>
+        <w:spacing w:line="360" w:lineRule="auto"/>
+      </w:pPr>
+      <w:r>
+        <w:rPr>
+          <w:rFonts w:ascii="Segoe UI" w:hAnsi="Segoe UI" w:cs="Segoe UI"/>
+          <w:sz w:val="24"/>
+          <w:szCs w:val="24"/>
+        </w:rPr>
+        <w:drawing>
+          <wp:inline distT="0" distB="0" distL="0" distR="0" wp14:anchorId="7F58BB86" wp14:editId="7464C56F">
+            <wp:extent cx="5731510" cy="4244340"/>
+            <wp:effectExtent l="0" t="0" r="2540" b="3810"/>
+            <wp:docPr id="779651644" name="Picture 1"/>
+            <wp:cNvGraphicFramePr>
+              <a:graphicFrameLocks xmlns:a="http://schemas.openxmlformats.org/drawingml/2006/main" noChangeAspect="1"/>
+            </wp:cNvGraphicFramePr>
+            <a:graphic xmlns:a="http://schemas.openxmlformats.org/drawingml/2006/main">
+              <a:graphicData uri="http://schemas.openxmlformats.org/drawingml/2006/picture">
+                <pic:pic xmlns:pic="http://schemas.openxmlformats.org/drawingml/2006/picture">
+                  <pic:nvPicPr>
+                    <pic:cNvPr id="779651644" name=""/>
+                    <pic:cNvPicPr/>
+                  </pic:nvPicPr>
+                  <pic:blipFill>
+                    <a:blip r:embed="rId9"/>
+                    <a:stretch>
+                      <a:fillRect/>
+                    </a:stretch>
+                  </pic:blipFill>
+                  <pic:spPr>
+                    <a:xfrm>
+                      <a:off x="0" y="0"/>
+                      <a:ext cx="5731510" cy="4244340"/>
+                    </a:xfrm>
+                    <a:prstGeom prst="rect">
+                      <a:avLst/>
+                    </a:prstGeom>
+                  </pic:spPr>
+                </pic:pic>
+              </a:graphicData>
+            </a:graphic>
+          </wp:inline>
+        </w:drawing>
+      </w:r>
+    </w:p>
+    <w:p>
+      <w:pPr>
+        <w:pStyle w:val="Caption"/>
+        <w:rPr>
+          <w:rFonts w:ascii="Segoe UI" w:hAnsi="Segoe UI" w:cs="Segoe UI"/>
+          <w:sz w:val="24"/>
+          <w:szCs w:val="24"/>
+        </w:rPr>
+      </w:pPr>
+      <w:r>
+        <w:t xml:space="preserve">Figure </w:t>
+      </w:r>
+      <w:fldSimple w:instr=" SEQ Figure \* ARABIC ">
+        <w:r>
+          <w:rPr>
+            <w:noProof/>
+          </w:rPr>
+          <w:t>2</w:t>
+        </w:r>
+      </w:fldSimple>
+      <w:r>
+        <w:t xml:space="preserve"> Boxplot of total_runs</w:t>
+      </w:r>
+    </w:p>
+    <w:p>
+      <w:pPr>
+        <w:spacing w:line="360" w:lineRule="auto"/>
+        <w:rPr>
+          <w:rFonts w:ascii="Segoe UI" w:hAnsi="Segoe UI" w:cs="Segoe UI"/>
+          <w:sz w:val="24"/>
+          <w:szCs w:val="24"/>
+        </w:rPr>
+      </w:pPr>
+      <w:r>
+        <w:rPr>
+          <w:rFonts w:ascii="Segoe UI" w:hAnsi="Segoe UI" w:cs="Segoe UI"/>
+          <w:sz w:val="24"/>
+          <w:szCs w:val="24"/>
+        </w:rPr>
+        <w:t>From this graph we can see 3 clear outliers, we will keep these outliers as these outliers represent the popularity of the game and how many attempts have been taken at a world record.</w:t>
+      </w:r>
+    </w:p>
+    <w:p>
+      <w:pPr>
+        <w:keepNext/>
+        <w:spacing w:line="360" w:lineRule="auto"/>
+      </w:pPr>
+      <w:r>
+        <w:rPr>
+          <w:rFonts w:ascii="Segoe UI" w:hAnsi="Segoe UI" w:cs="Segoe UI"/>
+          <w:sz w:val="24"/>
+          <w:szCs w:val="24"/>
+        </w:rPr>
+        <w:lastRenderedPageBreak/>
+        <w:drawing>
+          <wp:inline distT="0" distB="0" distL="0" distR="0" wp14:anchorId="6705AADF" wp14:editId="66C6D313">
+            <wp:extent cx="5731510" cy="4298950"/>
+            <wp:effectExtent l="0" t="0" r="2540" b="6350"/>
+            <wp:docPr id="674921620" name="Picture 1"/>
+            <wp:cNvGraphicFramePr>
+              <a:graphicFrameLocks xmlns:a="http://schemas.openxmlformats.org/drawingml/2006/main" noChangeAspect="1"/>
+            </wp:cNvGraphicFramePr>
+            <a:graphic xmlns:a="http://schemas.openxmlformats.org/drawingml/2006/main">
+              <a:graphicData uri="http://schemas.openxmlformats.org/drawingml/2006/picture">
+                <pic:pic xmlns:pic="http://schemas.openxmlformats.org/drawingml/2006/picture">
+                  <pic:nvPicPr>
+                    <pic:cNvPr id="674921620" name=""/>
+                    <pic:cNvPicPr/>
+                  </pic:nvPicPr>
+                  <pic:blipFill>
+                    <a:blip r:embed="rId10"/>
+                    <a:stretch>
+                      <a:fillRect/>
+                    </a:stretch>
+                  </pic:blipFill>
+                  <pic:spPr>
+                    <a:xfrm>
+                      <a:off x="0" y="0"/>
+                      <a:ext cx="5731510" cy="4298950"/>
+                    </a:xfrm>
+                    <a:prstGeom prst="rect">
+                      <a:avLst/>
+                    </a:prstGeom>
+                  </pic:spPr>
+                </pic:pic>
+              </a:graphicData>
+            </a:graphic>
+          </wp:inline>
+        </w:drawing>
+      </w:r>
+    </w:p>
+    <w:p>
+      <w:pPr>
+        <w:pStyle w:val="Caption"/>
+      </w:pPr>
+      <w:r>
+        <w:t xml:space="preserve">Figure </w:t>
+      </w:r>
+      <w:fldSimple w:instr=" SEQ Figure \* ARABIC ">
+        <w:r>
+          <w:rPr>
+            <w:noProof/>
+          </w:rPr>
+          <w:t>3</w:t>
+        </w:r>
+      </w:fldSimple>
+      <w:r>
+        <w:t xml:space="preserve"> Boxplot of World Record Time</w:t>
+      </w:r>
+    </w:p>
+    <w:p>
+      <w:pPr>
+        <w:spacing w:line="360" w:lineRule="auto"/>
+        <w:rPr>
+          <w:rFonts w:ascii="Segoe UI" w:hAnsi="Segoe UI" w:cs="Segoe UI"/>
+          <w:sz w:val="24"/>
+          <w:szCs w:val="24"/>
+        </w:rPr>
+      </w:pPr>
+      <w:r>
+        <w:rPr>
+          <w:rFonts w:ascii="Segoe UI" w:hAnsi="Segoe UI" w:cs="Segoe UI"/>
+          <w:sz w:val="24"/>
+          <w:szCs w:val="24"/>
+        </w:rPr>
+        <w:t xml:space="preserve"> This boxplot represents the world record time in seconds. These outliers represent the games which require a longer amount of time to complete</w:t>
+      </w:r>
+      <w:r>
+        <w:rPr>
+          <w:rFonts w:ascii="Segoe UI" w:hAnsi="Segoe UI" w:cs="Segoe UI"/>
+          <w:sz w:val="24"/>
+          <w:szCs w:val="24"/>
+        </w:rPr>
+        <w:t xml:space="preserve"> and require more focus and determination by the player due to the length of the speedrun. I decided to keep these outliers because they represent the variance in length between world record times and the dedication and focus required to attempt the world record.</w:t>
+      </w:r>
+    </w:p>
+    <w:p>
+      <w:pPr>
+        <w:spacing w:line="360" w:lineRule="auto"/>
+        <w:rPr>
+          <w:rFonts w:ascii="Segoe UI" w:hAnsi="Segoe UI" w:cs="Segoe UI"/>
+        </w:rPr>
+      </w:pPr>
+    </w:p>
+    <w:p>
+      <w:pPr>
+        <w:keepNext/>
+        <w:spacing w:line="360" w:lineRule="auto"/>
+      </w:pPr>
+      <w:r>
+        <w:rPr>
+          <w:rFonts w:ascii="Segoe UI" w:hAnsi="Segoe UI" w:cs="Segoe UI"/>
+        </w:rPr>
+        <w:lastRenderedPageBreak/>
+        <w:drawing>
+          <wp:inline distT="0" distB="0" distL="0" distR="0" wp14:anchorId="5604EA54" wp14:editId="06B39110">
+            <wp:extent cx="5731510" cy="4298950"/>
+            <wp:effectExtent l="0" t="0" r="2540" b="6350"/>
+            <wp:docPr id="7544525" name="Picture 1"/>
+            <wp:cNvGraphicFramePr>
+              <a:graphicFrameLocks xmlns:a="http://schemas.openxmlformats.org/drawingml/2006/main" noChangeAspect="1"/>
+            </wp:cNvGraphicFramePr>
+            <a:graphic xmlns:a="http://schemas.openxmlformats.org/drawingml/2006/main">
+              <a:graphicData uri="http://schemas.openxmlformats.org/drawingml/2006/picture">
+                <pic:pic xmlns:pic="http://schemas.openxmlformats.org/drawingml/2006/picture">
+                  <pic:nvPicPr>
+                    <pic:cNvPr id="7544525" name=""/>
+                    <pic:cNvPicPr/>
+                  </pic:nvPicPr>
+                  <pic:blipFill>
+                    <a:blip r:embed="rId11"/>
+                    <a:stretch>
+                      <a:fillRect/>
+                    </a:stretch>
+                  </pic:blipFill>
+                  <pic:spPr>
+                    <a:xfrm>
+                      <a:off x="0" y="0"/>
+                      <a:ext cx="5731510" cy="4298950"/>
+                    </a:xfrm>
+                    <a:prstGeom prst="rect">
+                      <a:avLst/>
+                    </a:prstGeom>
+                  </pic:spPr>
+                </pic:pic>
+              </a:graphicData>
+            </a:graphic>
+          </wp:inline>
+        </w:drawing>
+      </w:r>
+    </w:p>
+    <w:p>
+      <w:pPr>
+        <w:pStyle w:val="Caption"/>
+        <w:rPr>
+          <w:rFonts w:ascii="Segoe UI" w:hAnsi="Segoe UI" w:cs="Segoe UI"/>
+        </w:rPr>
+      </w:pPr>
+      <w:r>
+        <w:t xml:space="preserve">Figure </w:t>
+      </w:r>
+      <w:fldSimple w:instr=" SEQ Figure \* ARABIC ">
+        <w:r>
+          <w:rPr>
+            <w:noProof/>
+          </w:rPr>
+          <w:t>4</w:t>
+        </w:r>
+      </w:fldSimple>
+      <w:r>
+        <w:t xml:space="preserve"> Boxplot of world_record_age</w:t>
+      </w:r>
+    </w:p>
+    <w:p>
+      <w:pPr>
+        <w:spacing w:line="360" w:lineRule="auto"/>
+        <w:rPr>
+          <w:rFonts w:ascii="Segoe UI" w:hAnsi="Segoe UI" w:cs="Segoe UI"/>
+          <w:sz w:val="24"/>
+          <w:szCs w:val="24"/>
+        </w:rPr>
+      </w:pPr>
+      <w:r>
+        <w:rPr>
+          <w:rFonts w:ascii="Segoe UI" w:hAnsi="Segoe UI" w:cs="Segoe UI"/>
+          <w:sz w:val="24"/>
+          <w:szCs w:val="24"/>
+        </w:rPr>
+        <w:t xml:space="preserve">This </w:t>
+      </w:r>
+      <w:r>
+        <w:rPr>
+          <w:rFonts w:ascii="Segoe UI" w:hAnsi="Segoe UI" w:cs="Segoe UI"/>
+          <w:sz w:val="24"/>
+          <w:szCs w:val="24"/>
+        </w:rPr>
+        <w:t>boxplot represents how long a world record has been held</w:t>
+      </w:r>
+      <w:r>
+        <w:rPr>
+          <w:rFonts w:ascii="Segoe UI" w:hAnsi="Segoe UI" w:cs="Segoe UI"/>
+          <w:sz w:val="24"/>
+          <w:szCs w:val="24"/>
+        </w:rPr>
+        <w:t>. There</w:t>
+      </w:r>
+      <w:r>
+        <w:rPr>
+          <w:rFonts w:ascii="Segoe UI" w:hAnsi="Segoe UI" w:cs="Segoe UI"/>
+          <w:sz w:val="24"/>
+          <w:szCs w:val="24"/>
+        </w:rPr>
+        <w:t xml:space="preserve"> are a significant number of outliers in this boxplot. I chose to keep these outliers</w:t>
+      </w:r>
+      <w:r>
+        <w:rPr>
+          <w:rFonts w:ascii="Segoe UI" w:hAnsi="Segoe UI" w:cs="Segoe UI"/>
+          <w:sz w:val="24"/>
+          <w:szCs w:val="24"/>
+        </w:rPr>
+        <w:t xml:space="preserve"> because it represents the difficulty scale of beating a world record. If a record has been held for a 1000+ days, it demonstrates how precise and efficient the world record holder had to be to achieve their record.</w:t>
+      </w:r>
+    </w:p>
+    <w:p>
+      <w:pPr>
+        <w:spacing w:line="360" w:lineRule="auto"/>
+        <w:rPr>
+          <w:rFonts w:ascii="Segoe UI" w:hAnsi="Segoe UI" w:cs="Segoe UI"/>
+          <w:sz w:val="24"/>
+          <w:szCs w:val="24"/>
+        </w:rPr>
+      </w:pPr>
+    </w:p>
+    <w:p>
+      <w:pPr>
+        <w:keepNext/>
+        <w:spacing w:line="360" w:lineRule="auto"/>
+      </w:pPr>
+      <w:r>
+        <w:rPr>
+          <w:rFonts w:ascii="Segoe UI" w:hAnsi="Segoe UI" w:cs="Segoe UI"/>
+        </w:rPr>
+        <w:lastRenderedPageBreak/>
+        <w:drawing>
+          <wp:inline distT="0" distB="0" distL="0" distR="0" wp14:anchorId="1AC9312F" wp14:editId="47DD85B4">
+            <wp:extent cx="5731510" cy="4354195"/>
+            <wp:effectExtent l="0" t="0" r="2540" b="8255"/>
+            <wp:docPr id="212940910" name="Picture 1"/>
+            <wp:cNvGraphicFramePr>
+              <a:graphicFrameLocks xmlns:a="http://schemas.openxmlformats.org/drawingml/2006/main" noChangeAspect="1"/>
+            </wp:cNvGraphicFramePr>
+            <a:graphic xmlns:a="http://schemas.openxmlformats.org/drawingml/2006/main">
+              <a:graphicData uri="http://schemas.openxmlformats.org/drawingml/2006/picture">
+                <pic:pic xmlns:pic="http://schemas.openxmlformats.org/drawingml/2006/picture">
+                  <pic:nvPicPr>
+                    <pic:cNvPr id="212940910" name=""/>
+                    <pic:cNvPicPr/>
+                  </pic:nvPicPr>
+                  <pic:blipFill>
+                    <a:blip r:embed="rId12"/>
+                    <a:stretch>
+                      <a:fillRect/>
+                    </a:stretch>
+                  </pic:blipFill>
+                  <pic:spPr>
+                    <a:xfrm>
+                      <a:off x="0" y="0"/>
+                      <a:ext cx="5731510" cy="4354195"/>
+                    </a:xfrm>
+                    <a:prstGeom prst="rect">
+                      <a:avLst/>
+                    </a:prstGeom>
+                  </pic:spPr>
+                </pic:pic>
+              </a:graphicData>
+            </a:graphic>
+          </wp:inline>
+        </w:drawing>
+      </w:r>
+    </w:p>
+    <w:p>
+      <w:pPr>
+        <w:pStyle w:val="Caption"/>
+        <w:rPr>
+          <w:rFonts w:ascii="Segoe UI" w:hAnsi="Segoe UI" w:cs="Segoe UI"/>
+        </w:rPr>
+      </w:pPr>
+      <w:r>
+        <w:t xml:space="preserve">Figure </w:t>
+      </w:r>
+      <w:fldSimple w:instr=" SEQ Figure \* ARABIC ">
+        <w:r>
+          <w:rPr>
+            <w:noProof/>
+          </w:rPr>
+          <w:t>5</w:t>
+        </w:r>
+      </w:fldSimple>
+      <w:r>
+        <w:t xml:space="preserve"> Boxplot for margin between the world record holder and runner-up</w:t>
+      </w:r>
+    </w:p>
+    <w:p>
+      <w:pPr>
+        <w:spacing w:line="360" w:lineRule="auto"/>
+        <w:rPr>
+          <w:rFonts w:ascii="Segoe UI" w:hAnsi="Segoe UI" w:cs="Segoe UI"/>
+          <w:sz w:val="24"/>
+          <w:szCs w:val="24"/>
+        </w:rPr>
+      </w:pPr>
+      <w:r>
+        <w:rPr>
+          <w:rFonts w:ascii="Segoe UI" w:hAnsi="Segoe UI" w:cs="Segoe UI"/>
+          <w:sz w:val="24"/>
+          <w:szCs w:val="24"/>
+        </w:rPr>
+        <w:t>This data represents the margin between the world record holder and runner-up. The outliers demonstrate a wider margin which indicates to a new player that there was a significant room for improvement meaning that the record is not fully optimised yet. I chose to keep these outliers because it represents how optimised a world record is.</w:t>
+      </w:r>
+    </w:p>
+    <w:p>
+      <w:pPr>
+        <w:spacing w:line="360" w:lineRule="auto"/>
+        <w:rPr>
+          <w:rFonts w:ascii="Segoe UI" w:hAnsi="Segoe UI" w:cs="Segoe UI"/>
+        </w:rPr>
+      </w:pPr>
+    </w:p>
+    <w:p>
+      <w:pPr>
+        <w:keepNext/>
+        <w:spacing w:line="360" w:lineRule="auto"/>
+      </w:pPr>
+      <w:r>
+        <w:rPr>
+          <w:rFonts w:ascii="Segoe UI" w:hAnsi="Segoe UI" w:cs="Segoe UI"/>
+        </w:rPr>
+        <w:lastRenderedPageBreak/>
+        <w:drawing>
+          <wp:inline distT="0" distB="0" distL="0" distR="0" wp14:anchorId="239DAF77" wp14:editId="4E0C4004">
+            <wp:extent cx="5731510" cy="4379595"/>
+            <wp:effectExtent l="0" t="0" r="2540" b="1905"/>
+            <wp:docPr id="2099675537" name="Picture 1"/>
+            <wp:cNvGraphicFramePr>
+              <a:graphicFrameLocks xmlns:a="http://schemas.openxmlformats.org/drawingml/2006/main" noChangeAspect="1"/>
+            </wp:cNvGraphicFramePr>
+            <a:graphic xmlns:a="http://schemas.openxmlformats.org/drawingml/2006/main">
+              <a:graphicData uri="http://schemas.openxmlformats.org/drawingml/2006/picture">
+                <pic:pic xmlns:pic="http://schemas.openxmlformats.org/drawingml/2006/picture">
+                  <pic:nvPicPr>
+                    <pic:cNvPr id="2099675537" name=""/>
+                    <pic:cNvPicPr/>
+                  </pic:nvPicPr>
+                  <pic:blipFill>
+                    <a:blip r:embed="rId13"/>
+                    <a:stretch>
+                      <a:fillRect/>
+                    </a:stretch>
+                  </pic:blipFill>
+                  <pic:spPr>
+                    <a:xfrm>
+                      <a:off x="0" y="0"/>
+                      <a:ext cx="5731510" cy="4379595"/>
+                    </a:xfrm>
+                    <a:prstGeom prst="rect">
+                      <a:avLst/>
+                    </a:prstGeom>
+                  </pic:spPr>
+                </pic:pic>
+              </a:graphicData>
+            </a:graphic>
+          </wp:inline>
+        </w:drawing>
+      </w:r>
+    </w:p>
+    <w:p>
+      <w:pPr>
+        <w:pStyle w:val="Caption"/>
+        <w:rPr>
+          <w:rFonts w:ascii="Segoe UI" w:hAnsi="Segoe UI" w:cs="Segoe UI"/>
+        </w:rPr>
+      </w:pPr>
+      <w:r>
+        <w:t xml:space="preserve">Figure </w:t>
+      </w:r>
+      <w:fldSimple w:instr=" SEQ Figure \* ARABIC ">
+        <w:r>
+          <w:rPr>
+            <w:noProof/>
+          </w:rPr>
+          <w:t>6</w:t>
+        </w:r>
+      </w:fldSimple>
+      <w:r>
+        <w:t xml:space="preserve"> Boxplot of casual completion of a game</w:t>
+      </w:r>
+    </w:p>
+    <w:p>
+      <w:pPr>
+        <w:spacing w:line="360" w:lineRule="auto"/>
+        <w:rPr>
+          <w:rFonts w:ascii="Segoe UI" w:hAnsi="Segoe UI" w:cs="Segoe UI"/>
+          <w:sz w:val="24"/>
+          <w:szCs w:val="24"/>
+        </w:rPr>
+      </w:pPr>
+      <w:r>
+        <w:rPr>
+          <w:rFonts w:ascii="Segoe UI" w:hAnsi="Segoe UI" w:cs="Segoe UI"/>
+          <w:sz w:val="24"/>
+          <w:szCs w:val="24"/>
+        </w:rPr>
+        <w:t>This boxplot has 1 clear outlier that is “squishing” and distorting the data. This extreme outlier represents the extreme length of a casual playthrough and the challenge of optimising your time within that game, which is why I decided to keep this outlier but have taken note of its distorting impact.</w:t>
+      </w:r>
+    </w:p>
+    <w:p>
+      <w:pPr>
+        <w:spacing w:line="360" w:lineRule="auto"/>
+        <w:rPr>
+          <w:rFonts w:ascii="Segoe UI" w:hAnsi="Segoe UI" w:cs="Segoe UI"/>
+        </w:rPr>
+      </w:pPr>
+    </w:p>
+    <w:p>
+      <w:pPr>
+        <w:keepNext/>
+        <w:spacing w:line="360" w:lineRule="auto"/>
+      </w:pPr>
+      <w:r>
+        <w:rPr>
+          <w:rFonts w:ascii="Segoe UI" w:hAnsi="Segoe UI" w:cs="Segoe UI"/>
+        </w:rPr>
+        <w:lastRenderedPageBreak/>
+        <w:drawing>
+          <wp:inline distT="0" distB="0" distL="0" distR="0" wp14:anchorId="272B42FC" wp14:editId="684D47E1">
+            <wp:extent cx="5731510" cy="4354195"/>
+            <wp:effectExtent l="0" t="0" r="2540" b="8255"/>
+            <wp:docPr id="1366726897" name="Picture 1"/>
+            <wp:cNvGraphicFramePr>
+              <a:graphicFrameLocks xmlns:a="http://schemas.openxmlformats.org/drawingml/2006/main" noChangeAspect="1"/>
+            </wp:cNvGraphicFramePr>
+            <a:graphic xmlns:a="http://schemas.openxmlformats.org/drawingml/2006/main">
+              <a:graphicData uri="http://schemas.openxmlformats.org/drawingml/2006/picture">
+                <pic:pic xmlns:pic="http://schemas.openxmlformats.org/drawingml/2006/picture">
+                  <pic:nvPicPr>
+                    <pic:cNvPr id="1366726897" name=""/>
+                    <pic:cNvPicPr/>
+                  </pic:nvPicPr>
+                  <pic:blipFill>
+                    <a:blip r:embed="rId14"/>
+                    <a:stretch>
+                      <a:fillRect/>
+                    </a:stretch>
+                  </pic:blipFill>
+                  <pic:spPr>
+                    <a:xfrm>
+                      <a:off x="0" y="0"/>
+                      <a:ext cx="5731510" cy="4354195"/>
+                    </a:xfrm>
+                    <a:prstGeom prst="rect">
+                      <a:avLst/>
+                    </a:prstGeom>
+                  </pic:spPr>
+                </pic:pic>
+              </a:graphicData>
+            </a:graphic>
+          </wp:inline>
+        </w:drawing>
+      </w:r>
+    </w:p>
+    <w:p>
+      <w:pPr>
+        <w:pStyle w:val="Caption"/>
+        <w:rPr>
+          <w:rFonts w:ascii="Segoe UI" w:hAnsi="Segoe UI" w:cs="Segoe UI"/>
+        </w:rPr>
+      </w:pPr>
+      <w:r>
+        <w:t xml:space="preserve">Figure </w:t>
+      </w:r>
+      <w:fldSimple w:instr=" SEQ Figure \* ARABIC ">
+        <w:r>
+          <w:rPr>
+            <w:noProof/>
+          </w:rPr>
+          <w:t>7</w:t>
+        </w:r>
+      </w:fldSimple>
+      <w:r>
+        <w:t xml:space="preserve"> Boxplot of active runners</w:t>
+      </w:r>
+    </w:p>
+    <w:p>
+      <w:pPr>
+        <w:spacing w:line="360" w:lineRule="auto"/>
+        <w:rPr>
+          <w:rFonts w:ascii="Segoe UI" w:hAnsi="Segoe UI" w:cs="Segoe UI"/>
+          <w:sz w:val="24"/>
+          <w:szCs w:val="24"/>
+        </w:rPr>
+      </w:pPr>
+      <w:r>
+        <w:rPr>
+          <w:rFonts w:ascii="Segoe UI" w:hAnsi="Segoe UI" w:cs="Segoe UI"/>
+          <w:sz w:val="24"/>
+          <w:szCs w:val="24"/>
+        </w:rPr>
+        <w:t xml:space="preserve">This boxplot represents the popularity of current games with speedrunners. The outliers are representing the number of </w:t>
+      </w:r>
+      <w:proofErr w:type="gramStart"/>
+      <w:r>
+        <w:rPr>
+          <w:rFonts w:ascii="Segoe UI" w:hAnsi="Segoe UI" w:cs="Segoe UI"/>
+          <w:sz w:val="24"/>
+          <w:szCs w:val="24"/>
+        </w:rPr>
+        <w:t>competition</w:t>
+      </w:r>
+      <w:proofErr w:type="gramEnd"/>
+      <w:r>
+        <w:rPr>
+          <w:rFonts w:ascii="Segoe UI" w:hAnsi="Segoe UI" w:cs="Segoe UI"/>
+          <w:sz w:val="24"/>
+          <w:szCs w:val="24"/>
+        </w:rPr>
+        <w:t xml:space="preserve"> that a new player would be faced with when attempting a world record. For this reason, I decided to keep these outliers.</w:t>
+      </w:r>
+    </w:p>
+    <w:p>
+      <w:pPr>
+        <w:spacing w:line="360" w:lineRule="auto"/>
+        <w:rPr>
+          <w:rFonts w:ascii="Segoe UI" w:hAnsi="Segoe UI" w:cs="Segoe UI"/>
+          <w:sz w:val="24"/>
+          <w:szCs w:val="24"/>
+        </w:rPr>
+      </w:pPr>
+    </w:p>
+    <w:p>
+      <w:pPr>
+        <w:spacing w:line="360" w:lineRule="auto"/>
+        <w:rPr>
+          <w:rFonts w:ascii="Segoe UI" w:hAnsi="Segoe UI" w:cs="Segoe UI"/>
+          <w:sz w:val="24"/>
+          <w:szCs w:val="24"/>
+        </w:rPr>
+      </w:pPr>
+      <w:r>
+        <w:rPr>
+          <w:rFonts w:ascii="Segoe UI" w:hAnsi="Segoe UI" w:cs="Segoe UI"/>
+          <w:sz w:val="24"/>
+          <w:szCs w:val="24"/>
+        </w:rPr>
+        <w:t xml:space="preserve">My reasoning behind keeping </w:t>
+      </w:r>
+      <w:proofErr w:type="gramStart"/>
+      <w:r>
+        <w:rPr>
+          <w:rFonts w:ascii="Segoe UI" w:hAnsi="Segoe UI" w:cs="Segoe UI"/>
+          <w:sz w:val="24"/>
+          <w:szCs w:val="24"/>
+        </w:rPr>
+        <w:t>all of</w:t>
+      </w:r>
+      <w:proofErr w:type="gramEnd"/>
+      <w:r>
+        <w:rPr>
+          <w:rFonts w:ascii="Segoe UI" w:hAnsi="Segoe UI" w:cs="Segoe UI"/>
+          <w:sz w:val="24"/>
+          <w:szCs w:val="24"/>
+        </w:rPr>
+        <w:t xml:space="preserve"> the outliers presented in the data is due to the realistic impact they display. In my theoretical framework, I stated that “</w:t>
+      </w:r>
+      <w:r>
+        <w:rPr>
+          <w:rFonts w:ascii="Segoe UI" w:hAnsi="Segoe UI" w:cs="Segoe UI"/>
+          <w:sz w:val="24"/>
+          <w:szCs w:val="24"/>
+        </w:rPr>
+        <w:t xml:space="preserve">the problem I identified was the lack of </w:t>
+      </w:r>
+      <w:r>
+        <w:rPr>
+          <w:rFonts w:ascii="Segoe UI" w:hAnsi="Segoe UI" w:cs="Segoe UI"/>
+          <w:sz w:val="24"/>
+          <w:szCs w:val="24"/>
+        </w:rPr>
+        <w:t>understanding</w:t>
+      </w:r>
+      <w:r>
+        <w:rPr>
+          <w:rFonts w:ascii="Segoe UI" w:hAnsi="Segoe UI" w:cs="Segoe UI"/>
+          <w:sz w:val="24"/>
+          <w:szCs w:val="24"/>
+        </w:rPr>
+        <w:t xml:space="preserve"> surrounding the dedication required to achieve a world record</w:t>
+      </w:r>
+      <w:r>
+        <w:rPr>
+          <w:rFonts w:ascii="Segoe UI" w:hAnsi="Segoe UI" w:cs="Segoe UI"/>
+          <w:sz w:val="24"/>
+          <w:szCs w:val="24"/>
+        </w:rPr>
+        <w:t>”</w:t>
+      </w:r>
+      <w:r>
+        <w:rPr>
+          <w:rFonts w:ascii="Segoe UI" w:hAnsi="Segoe UI" w:cs="Segoe UI"/>
+          <w:sz w:val="24"/>
+          <w:szCs w:val="24"/>
+        </w:rPr>
+        <w:t>.</w:t>
+      </w:r>
+      <w:r>
+        <w:rPr>
+          <w:rFonts w:ascii="Segoe UI" w:hAnsi="Segoe UI" w:cs="Segoe UI"/>
+          <w:sz w:val="24"/>
+          <w:szCs w:val="24"/>
+        </w:rPr>
+        <w:t xml:space="preserve"> These outliers represent the dedication and </w:t>
+      </w:r>
+      <w:proofErr w:type="gramStart"/>
+      <w:r>
+        <w:rPr>
+          <w:rFonts w:ascii="Segoe UI" w:hAnsi="Segoe UI" w:cs="Segoe UI"/>
+          <w:sz w:val="24"/>
+          <w:szCs w:val="24"/>
+        </w:rPr>
+        <w:t>challenges</w:t>
+      </w:r>
+      <w:proofErr w:type="gramEnd"/>
+      <w:r>
+        <w:rPr>
+          <w:rFonts w:ascii="Segoe UI" w:hAnsi="Segoe UI" w:cs="Segoe UI"/>
+          <w:sz w:val="24"/>
+          <w:szCs w:val="24"/>
+        </w:rPr>
+        <w:t xml:space="preserve"> that new players will face on their journey to become a world record holder. I have noted that these outliers will impact my index due to the benchmarking issues they create.</w:t>
+      </w:r>
     </w:p>
     <w:p>
       <w:pPr>
@@ -1739,6 +4219,7 @@
           <w:sz w:val="28"/>
           <w:szCs w:val="28"/>
         </w:rPr>
+        <w:lastRenderedPageBreak/>
         <w:t>Multivariate Analysis</w:t>
       </w:r>
     </w:p>
@@ -2773,7 +5254,7 @@
       </w:pPr>
     </w:p>
     <w:sectPr>
-      <w:footerReference w:type="default" r:id="rId8"/>
+      <w:footerReference w:type="default" r:id="rId15"/>
       <w:pgSz w:w="11906" w:h="16838"/>
       <w:pgMar w:top="1440" w:right="1440" w:bottom="1440" w:left="1440" w:header="708" w:footer="708" w:gutter="0"/>
       <w:pgBorders w:offsetFrom="page">
@@ -3968,7 +6449,6 @@
   <w:style w:type="character" w:default="1" w:styleId="DefaultParagraphFont">
     <w:name w:val="Default Paragraph Font"/>
     <w:uiPriority w:val="1"/>
-    <w:semiHidden/>
     <w:unhideWhenUsed/>
   </w:style>
   <w:style w:type="table" w:default="1" w:styleId="TableNormal">
@@ -4373,6 +6853,25 @@
     <w:uiPriority w:val="99"/>
     <w:rsid w:val="00F12976"/>
   </w:style>
+  <w:style w:type="table" w:styleId="TableGrid">
+    <w:name w:val="Table Grid"/>
+    <w:basedOn w:val="TableNormal"/>
+    <w:uiPriority w:val="39"/>
+    <w:rsid w:val="00A934D2"/>
+    <w:pPr>
+      <w:spacing w:after="0" w:line="240" w:lineRule="auto"/>
+    </w:pPr>
+    <w:tblPr>
+      <w:tblBorders>
+        <w:top w:val="single" w:sz="4" w:space="0" w:color="auto"/>
+        <w:left w:val="single" w:sz="4" w:space="0" w:color="auto"/>
+        <w:bottom w:val="single" w:sz="4" w:space="0" w:color="auto"/>
+        <w:right w:val="single" w:sz="4" w:space="0" w:color="auto"/>
+        <w:insideH w:val="single" w:sz="4" w:space="0" w:color="auto"/>
+        <w:insideV w:val="single" w:sz="4" w:space="0" w:color="auto"/>
+      </w:tblBorders>
+    </w:tblPr>
+  </w:style>
 </w:styles>
 </file>
 

</xml_diff>